<commit_message>
doc: modify domain model
</commit_message>
<xml_diff>
--- a/document/hw6.docx
+++ b/document/hw6.docx
@@ -83,8 +83,6 @@
           <w:szCs w:val="52"/>
         </w:rPr>
       </w:pPr>
-      <w:proofErr w:type="spellStart"/>
-      <w:proofErr w:type="gramStart"/>
       <w:r>
         <w:rPr>
           <w:rFonts w:ascii="Times New Roman" w:eastAsia="標楷體" w:hAnsi="Times New Roman" w:cs="Times New Roman" w:hint="eastAsia"/>
@@ -95,8 +93,6 @@
         </w:rPr>
         <w:t>Re:Book</w:t>
       </w:r>
-      <w:proofErr w:type="spellEnd"/>
-      <w:proofErr w:type="gramEnd"/>
     </w:p>
     <w:p>
       <w:pPr>
@@ -201,23 +197,21 @@
           <w:szCs w:val="40"/>
         </w:rPr>
       </w:pPr>
-      <w:proofErr w:type="gramStart"/>
       <w:r>
         <w:rPr>
           <w:rFonts w:ascii="Times New Roman" w:eastAsia="標楷體" w:hAnsi="Times New Roman" w:cs="Times New Roman"/>
           <w:sz w:val="40"/>
           <w:szCs w:val="40"/>
         </w:rPr>
-        <w:t>資工碩</w:t>
-      </w:r>
-      <w:proofErr w:type="gramEnd"/>
+        <w:t>資工碩二</w:t>
+      </w:r>
       <w:r>
         <w:rPr>
           <w:rFonts w:ascii="Times New Roman" w:eastAsia="標楷體" w:hAnsi="Times New Roman" w:cs="Times New Roman"/>
           <w:sz w:val="40"/>
           <w:szCs w:val="40"/>
         </w:rPr>
-        <w:t>二</w:t>
+        <w:t xml:space="preserve"> 113598037 </w:t>
       </w:r>
       <w:r>
         <w:rPr>
@@ -225,54 +219,26 @@
           <w:sz w:val="40"/>
           <w:szCs w:val="40"/>
         </w:rPr>
-        <w:t xml:space="preserve"> 113598037 </w:t>
-      </w:r>
-      <w:r>
+        <w:t>陳宥錡</w:t>
+      </w:r>
+    </w:p>
+    <w:p>
+      <w:pPr>
+        <w:jc w:val="center"/>
         <w:rPr>
           <w:rFonts w:ascii="Times New Roman" w:eastAsia="標楷體" w:hAnsi="Times New Roman" w:cs="Times New Roman"/>
           <w:sz w:val="40"/>
           <w:szCs w:val="40"/>
         </w:rPr>
-        <w:t>陳</w:t>
-      </w:r>
-      <w:proofErr w:type="gramStart"/>
+      </w:pPr>
       <w:r>
         <w:rPr>
           <w:rFonts w:ascii="Times New Roman" w:eastAsia="標楷體" w:hAnsi="Times New Roman" w:cs="Times New Roman"/>
           <w:sz w:val="40"/>
           <w:szCs w:val="40"/>
         </w:rPr>
-        <w:t>宥錡</w:t>
-      </w:r>
-      <w:proofErr w:type="gramEnd"/>
-    </w:p>
-    <w:p>
-      <w:pPr>
-        <w:jc w:val="center"/>
-        <w:rPr>
-          <w:rFonts w:ascii="Times New Roman" w:eastAsia="標楷體" w:hAnsi="Times New Roman" w:cs="Times New Roman"/>
-          <w:sz w:val="40"/>
-          <w:szCs w:val="40"/>
-        </w:rPr>
-      </w:pPr>
-      <w:r>
-        <w:rPr>
-          <w:rFonts w:ascii="Times New Roman" w:eastAsia="標楷體" w:hAnsi="Times New Roman" w:cs="Times New Roman"/>
-          <w:sz w:val="40"/>
-          <w:szCs w:val="40"/>
-        </w:rPr>
-        <w:t>資工碩</w:t>
-      </w:r>
-      <w:proofErr w:type="gramStart"/>
-      <w:r>
-        <w:rPr>
-          <w:rFonts w:ascii="Times New Roman" w:eastAsia="標楷體" w:hAnsi="Times New Roman" w:cs="Times New Roman"/>
-          <w:sz w:val="40"/>
-          <w:szCs w:val="40"/>
-        </w:rPr>
-        <w:t>一</w:t>
-      </w:r>
-      <w:proofErr w:type="gramEnd"/>
+        <w:t>資工碩一</w:t>
+      </w:r>
       <w:r>
         <w:rPr>
           <w:rFonts w:ascii="Times New Roman" w:eastAsia="標楷體" w:hAnsi="Times New Roman" w:cs="Times New Roman"/>
@@ -847,19 +813,11 @@
           <w:rFonts w:ascii="Times New Roman" w:eastAsia="標楷體" w:hAnsi="Times New Roman" w:cs="Times New Roman"/>
         </w:rPr>
       </w:pPr>
-      <w:proofErr w:type="spellStart"/>
       <w:r>
         <w:rPr>
           <w:rFonts w:ascii="Times New Roman" w:eastAsia="標楷體" w:hAnsi="Times New Roman" w:cs="Times New Roman" w:hint="eastAsia"/>
         </w:rPr>
-        <w:t>Re:Book</w:t>
-      </w:r>
-      <w:proofErr w:type="spellEnd"/>
-      <w:r>
-        <w:rPr>
-          <w:rFonts w:ascii="Times New Roman" w:eastAsia="標楷體" w:hAnsi="Times New Roman" w:cs="Times New Roman" w:hint="eastAsia"/>
-        </w:rPr>
-        <w:t xml:space="preserve"> </w:t>
+        <w:t xml:space="preserve">Re:Book </w:t>
       </w:r>
       <w:r>
         <w:rPr>
@@ -886,77 +844,41 @@
           <w:rFonts w:ascii="Times New Roman" w:eastAsia="標楷體" w:hAnsi="Times New Roman" w:cs="Times New Roman"/>
         </w:rPr>
       </w:pPr>
-      <w:proofErr w:type="spellStart"/>
       <w:r>
         <w:rPr>
           <w:rFonts w:ascii="Times New Roman" w:eastAsia="標楷體" w:hAnsi="Times New Roman" w:cs="Times New Roman" w:hint="eastAsia"/>
         </w:rPr>
-        <w:t>Re:Book</w:t>
-      </w:r>
-      <w:proofErr w:type="spellEnd"/>
+        <w:t xml:space="preserve">Re:Book </w:t>
+      </w:r>
       <w:r>
         <w:rPr>
           <w:rFonts w:ascii="Times New Roman" w:eastAsia="標楷體" w:hAnsi="Times New Roman" w:cs="Times New Roman" w:hint="eastAsia"/>
         </w:rPr>
-        <w:t xml:space="preserve"> </w:t>
+        <w:t>透過直觀且易於操作的交換機制，為二手書注入新的生命。賣家可輸入書名、作者、出版社或</w:t>
       </w:r>
       <w:r>
         <w:rPr>
           <w:rFonts w:ascii="Times New Roman" w:eastAsia="標楷體" w:hAnsi="Times New Roman" w:cs="Times New Roman" w:hint="eastAsia"/>
         </w:rPr>
-        <w:t>透過直觀且易於操作的交換機制，為二手書注入新的生命。賣家可輸入書名、作者、出版社或</w:t>
+        <w:t xml:space="preserve"> ISBN </w:t>
       </w:r>
       <w:r>
         <w:rPr>
           <w:rFonts w:ascii="Times New Roman" w:eastAsia="標楷體" w:hAnsi="Times New Roman" w:cs="Times New Roman" w:hint="eastAsia"/>
         </w:rPr>
-        <w:t xml:space="preserve"> ISBN </w:t>
+        <w:t>上架書籍，</w:t>
       </w:r>
       <w:r>
         <w:rPr>
           <w:rFonts w:ascii="Times New Roman" w:eastAsia="標楷體" w:hAnsi="Times New Roman" w:cs="Times New Roman" w:hint="eastAsia"/>
         </w:rPr>
-        <w:t>上架書籍，</w:t>
+        <w:t>並將待出售的書籍進行分</w:t>
       </w:r>
       <w:r>
         <w:rPr>
           <w:rFonts w:ascii="Times New Roman" w:eastAsia="標楷體" w:hAnsi="Times New Roman" w:cs="Times New Roman" w:hint="eastAsia"/>
         </w:rPr>
-        <w:t>並將待出售的書籍進行分</w:t>
-      </w:r>
-      <w:r>
-        <w:rPr>
-          <w:rFonts w:ascii="Times New Roman" w:eastAsia="標楷體" w:hAnsi="Times New Roman" w:cs="Times New Roman" w:hint="eastAsia"/>
-        </w:rPr>
-        <w:t>類。為體現對書本價值的尊重，賣家可設定期望售價，並上傳書</w:t>
-      </w:r>
-      <w:proofErr w:type="gramStart"/>
-      <w:r>
-        <w:rPr>
-          <w:rFonts w:ascii="Times New Roman" w:eastAsia="標楷體" w:hAnsi="Times New Roman" w:cs="Times New Roman" w:hint="eastAsia"/>
-        </w:rPr>
-        <w:t>況</w:t>
-      </w:r>
-      <w:proofErr w:type="gramEnd"/>
-      <w:r>
-        <w:rPr>
-          <w:rFonts w:ascii="Times New Roman" w:eastAsia="標楷體" w:hAnsi="Times New Roman" w:cs="Times New Roman" w:hint="eastAsia"/>
-        </w:rPr>
-        <w:t>照片或分享使用心得。潛在買家則可透過搜尋與篩選功能，快速找到所需書籍。平台同時</w:t>
-      </w:r>
-      <w:proofErr w:type="gramStart"/>
-      <w:r>
-        <w:rPr>
-          <w:rFonts w:ascii="Times New Roman" w:eastAsia="標楷體" w:hAnsi="Times New Roman" w:cs="Times New Roman" w:hint="eastAsia"/>
-        </w:rPr>
-        <w:t>提供私訊機制</w:t>
-      </w:r>
-      <w:proofErr w:type="gramEnd"/>
-      <w:r>
-        <w:rPr>
-          <w:rFonts w:ascii="Times New Roman" w:eastAsia="標楷體" w:hAnsi="Times New Roman" w:cs="Times New Roman" w:hint="eastAsia"/>
-        </w:rPr>
-        <w:t>，讓雙方協商最終價格與交付方式，確保知識的傳遞過程既順暢高效，也保有人與人之間的溫度。</w:t>
+        <w:t>類。為體現對書本價值的尊重，賣家可設定期望售價，並上傳書況照片或分享使用心得。潛在買家則可透過搜尋與篩選功能，快速找到所需書籍。平台同時提供私訊機制，讓雙方協商最終價格與交付方式，確保知識的傳遞過程既順暢高效，也保有人與人之間的溫度。</w:t>
       </w:r>
     </w:p>
     <w:p>
@@ -1184,14 +1106,12 @@
                 <w:rFonts w:ascii="Times New Roman" w:eastAsia="標楷體" w:hAnsi="Times New Roman" w:cs="Times New Roman"/>
               </w:rPr>
             </w:pPr>
-            <w:proofErr w:type="gramStart"/>
             <w:r>
               <w:rPr>
                 <w:rFonts w:ascii="Times New Roman" w:eastAsia="標楷體" w:hAnsi="Times New Roman" w:cs="Times New Roman" w:hint="eastAsia"/>
               </w:rPr>
               <w:t>發送私訊</w:t>
             </w:r>
-            <w:proofErr w:type="gramEnd"/>
           </w:p>
         </w:tc>
       </w:tr>
@@ -1497,16 +1417,12 @@
                 <w:rFonts w:ascii="Times New Roman" w:eastAsia="標楷體" w:hAnsi="Times New Roman" w:cs="Times New Roman"/>
               </w:rPr>
             </w:pPr>
-            <w:proofErr w:type="spellStart"/>
-            <w:proofErr w:type="gramStart"/>
             <w:r>
               <w:rPr>
                 <w:rFonts w:ascii="Times New Roman" w:eastAsia="標楷體" w:hAnsi="Times New Roman" w:cs="Times New Roman" w:hint="eastAsia"/>
               </w:rPr>
               <w:t>Re:Book</w:t>
             </w:r>
-            <w:proofErr w:type="spellEnd"/>
-            <w:proofErr w:type="gramEnd"/>
           </w:p>
         </w:tc>
       </w:tr>
@@ -1881,21 +1797,7 @@
               <w:rPr>
                 <w:rFonts w:ascii="Times New Roman" w:eastAsia="標楷體" w:hAnsi="Times New Roman" w:cs="Times New Roman" w:hint="eastAsia"/>
               </w:rPr>
-              <w:t>、書名、價格、書</w:t>
-            </w:r>
-            <w:proofErr w:type="gramStart"/>
-            <w:r>
-              <w:rPr>
-                <w:rFonts w:ascii="Times New Roman" w:eastAsia="標楷體" w:hAnsi="Times New Roman" w:cs="Times New Roman" w:hint="eastAsia"/>
-              </w:rPr>
-              <w:t>況</w:t>
-            </w:r>
-            <w:proofErr w:type="gramEnd"/>
-            <w:r>
-              <w:rPr>
-                <w:rFonts w:ascii="Times New Roman" w:eastAsia="標楷體" w:hAnsi="Times New Roman" w:cs="Times New Roman" w:hint="eastAsia"/>
-              </w:rPr>
-              <w:t>及</w:t>
+              <w:t>、書名、價格、書況及</w:t>
             </w:r>
             <w:r>
               <w:rPr>
@@ -1952,14 +1854,12 @@
               </w:rPr>
               <w:t>格式</w:t>
             </w:r>
-            <w:proofErr w:type="gramStart"/>
             <w:r>
               <w:rPr>
                 <w:rFonts w:ascii="Times New Roman" w:eastAsia="標楷體" w:hAnsi="Times New Roman" w:cs="Times New Roman" w:hint="eastAsia"/>
               </w:rPr>
               <w:t>與必填欄位</w:t>
             </w:r>
-            <w:proofErr w:type="gramEnd"/>
             <w:r>
               <w:rPr>
                 <w:rFonts w:ascii="Times New Roman" w:eastAsia="標楷體" w:hAnsi="Times New Roman" w:cs="Times New Roman" w:hint="eastAsia"/>
@@ -2648,16 +2548,12 @@
                 <w:rFonts w:ascii="Times New Roman" w:eastAsia="標楷體" w:hAnsi="Times New Roman" w:cs="Times New Roman"/>
               </w:rPr>
             </w:pPr>
-            <w:proofErr w:type="spellStart"/>
-            <w:proofErr w:type="gramStart"/>
             <w:r>
               <w:rPr>
                 <w:rFonts w:ascii="Times New Roman" w:eastAsia="標楷體" w:hAnsi="Times New Roman" w:cs="Times New Roman" w:hint="eastAsia"/>
               </w:rPr>
               <w:t>Re:Book</w:t>
             </w:r>
-            <w:proofErr w:type="spellEnd"/>
-            <w:proofErr w:type="gramEnd"/>
           </w:p>
         </w:tc>
       </w:tr>
@@ -2982,21 +2878,7 @@
               <w:rPr>
                 <w:rFonts w:ascii="Times New Roman" w:eastAsia="標楷體" w:hAnsi="Times New Roman" w:cs="Times New Roman" w:hint="eastAsia"/>
               </w:rPr>
-              <w:t>買家選擇篩選條件</w:t>
-            </w:r>
-            <w:proofErr w:type="gramStart"/>
-            <w:r>
-              <w:rPr>
-                <w:rFonts w:ascii="Times New Roman" w:eastAsia="標楷體" w:hAnsi="Times New Roman" w:cs="Times New Roman" w:hint="eastAsia"/>
-              </w:rPr>
-              <w:t>（</w:t>
-            </w:r>
-            <w:proofErr w:type="gramEnd"/>
-            <w:r>
-              <w:rPr>
-                <w:rFonts w:ascii="Times New Roman" w:eastAsia="標楷體" w:hAnsi="Times New Roman" w:cs="Times New Roman" w:hint="eastAsia"/>
-              </w:rPr>
-              <w:t>如：</w:t>
+              <w:t>買家選擇篩選條件（如：</w:t>
             </w:r>
             <w:r>
               <w:rPr>
@@ -3008,21 +2890,7 @@
               <w:rPr>
                 <w:rFonts w:ascii="Times New Roman" w:eastAsia="標楷體" w:hAnsi="Times New Roman" w:cs="Times New Roman" w:hint="eastAsia"/>
               </w:rPr>
-              <w:t>、價格範圍</w:t>
-            </w:r>
-            <w:proofErr w:type="gramStart"/>
-            <w:r>
-              <w:rPr>
-                <w:rFonts w:ascii="Times New Roman" w:eastAsia="標楷體" w:hAnsi="Times New Roman" w:cs="Times New Roman" w:hint="eastAsia"/>
-              </w:rPr>
-              <w:t>）</w:t>
-            </w:r>
-            <w:proofErr w:type="gramEnd"/>
-            <w:r>
-              <w:rPr>
-                <w:rFonts w:ascii="Times New Roman" w:eastAsia="標楷體" w:hAnsi="Times New Roman" w:cs="Times New Roman" w:hint="eastAsia"/>
-              </w:rPr>
-              <w:t>。</w:t>
+              <w:t>、價格範圍）。</w:t>
             </w:r>
           </w:p>
           <w:p>
@@ -3450,16 +3318,12 @@
                 <w:rFonts w:ascii="Times New Roman" w:eastAsia="標楷體" w:hAnsi="Times New Roman" w:cs="Times New Roman"/>
               </w:rPr>
             </w:pPr>
-            <w:proofErr w:type="spellStart"/>
-            <w:proofErr w:type="gramStart"/>
             <w:r>
               <w:rPr>
                 <w:rFonts w:ascii="Times New Roman" w:eastAsia="標楷體" w:hAnsi="Times New Roman" w:cs="Times New Roman" w:hint="eastAsia"/>
               </w:rPr>
               <w:t>Re:Book</w:t>
             </w:r>
-            <w:proofErr w:type="spellEnd"/>
-            <w:proofErr w:type="gramEnd"/>
           </w:p>
         </w:tc>
       </w:tr>
@@ -3760,35 +3624,7 @@
               <w:rPr>
                 <w:rFonts w:ascii="Times New Roman" w:eastAsia="標楷體" w:hAnsi="Times New Roman" w:cs="Times New Roman" w:hint="eastAsia"/>
               </w:rPr>
-              <w:t>系統顯示訂單資訊與線下交易選項</w:t>
-            </w:r>
-            <w:proofErr w:type="gramStart"/>
-            <w:r>
-              <w:rPr>
-                <w:rFonts w:ascii="Times New Roman" w:eastAsia="標楷體" w:hAnsi="Times New Roman" w:cs="Times New Roman" w:hint="eastAsia"/>
-              </w:rPr>
-              <w:t>（</w:t>
-            </w:r>
-            <w:proofErr w:type="gramEnd"/>
-            <w:r>
-              <w:rPr>
-                <w:rFonts w:ascii="Times New Roman" w:eastAsia="標楷體" w:hAnsi="Times New Roman" w:cs="Times New Roman" w:hint="eastAsia"/>
-              </w:rPr>
-              <w:t>如：面交付現、自行匯款</w:t>
-            </w:r>
-            <w:proofErr w:type="gramStart"/>
-            <w:r>
-              <w:rPr>
-                <w:rFonts w:ascii="Times New Roman" w:eastAsia="標楷體" w:hAnsi="Times New Roman" w:cs="Times New Roman" w:hint="eastAsia"/>
-              </w:rPr>
-              <w:t>）</w:t>
-            </w:r>
-            <w:proofErr w:type="gramEnd"/>
-            <w:r>
-              <w:rPr>
-                <w:rFonts w:ascii="Times New Roman" w:eastAsia="標楷體" w:hAnsi="Times New Roman" w:cs="Times New Roman" w:hint="eastAsia"/>
-              </w:rPr>
-              <w:t>。</w:t>
+              <w:t>系統顯示訂單資訊與線下交易選項（如：面交付現、自行匯款）。</w:t>
             </w:r>
           </w:p>
           <w:p>
@@ -4185,21 +4021,7 @@
               <w:rPr>
                 <w:rFonts w:ascii="Times New Roman" w:eastAsia="標楷體" w:hAnsi="Times New Roman" w:cs="Times New Roman"/>
               </w:rPr>
-              <w:t>是否需要設定自動取消機制？</w:t>
-            </w:r>
-            <w:proofErr w:type="gramStart"/>
-            <w:r>
-              <w:rPr>
-                <w:rFonts w:ascii="Times New Roman" w:eastAsia="標楷體" w:hAnsi="Times New Roman" w:cs="Times New Roman"/>
-              </w:rPr>
-              <w:t>（</w:t>
-            </w:r>
-            <w:proofErr w:type="gramEnd"/>
-            <w:r>
-              <w:rPr>
-                <w:rFonts w:ascii="Times New Roman" w:eastAsia="標楷體" w:hAnsi="Times New Roman" w:cs="Times New Roman"/>
-              </w:rPr>
-              <w:t>例如：訂單成立後</w:t>
+              <w:t>是否需要設定自動取消機制？（例如：訂單成立後</w:t>
             </w:r>
             <w:r>
               <w:rPr>
@@ -4211,21 +4033,7 @@
               <w:rPr>
                 <w:rFonts w:ascii="Times New Roman" w:eastAsia="標楷體" w:hAnsi="Times New Roman" w:cs="Times New Roman"/>
               </w:rPr>
-              <w:t>天內未點擊完成，系統自動取消並恢復書籍狀態</w:t>
-            </w:r>
-            <w:proofErr w:type="gramStart"/>
-            <w:r>
-              <w:rPr>
-                <w:rFonts w:ascii="Times New Roman" w:eastAsia="標楷體" w:hAnsi="Times New Roman" w:cs="Times New Roman"/>
-              </w:rPr>
-              <w:t>）</w:t>
-            </w:r>
-            <w:proofErr w:type="gramEnd"/>
-            <w:r>
-              <w:rPr>
-                <w:rFonts w:ascii="Times New Roman" w:eastAsia="標楷體" w:hAnsi="Times New Roman" w:cs="Times New Roman"/>
-              </w:rPr>
-              <w:t>。</w:t>
+              <w:t>天內未點擊完成，系統自動取消並恢復書籍狀態）。</w:t>
             </w:r>
           </w:p>
         </w:tc>
@@ -4350,16 +4158,12 @@
                 <w:rFonts w:ascii="Times New Roman" w:eastAsia="標楷體" w:hAnsi="Times New Roman" w:cs="Times New Roman"/>
               </w:rPr>
             </w:pPr>
-            <w:proofErr w:type="spellStart"/>
-            <w:proofErr w:type="gramStart"/>
             <w:r>
               <w:rPr>
                 <w:rFonts w:ascii="Times New Roman" w:eastAsia="標楷體" w:hAnsi="Times New Roman" w:cs="Times New Roman" w:hint="eastAsia"/>
               </w:rPr>
               <w:t>Re:Book</w:t>
             </w:r>
-            <w:proofErr w:type="spellEnd"/>
-            <w:proofErr w:type="gramEnd"/>
           </w:p>
         </w:tc>
       </w:tr>
@@ -4478,21 +4282,7 @@
               <w:rPr>
                 <w:rFonts w:ascii="Times New Roman" w:eastAsia="標楷體" w:hAnsi="Times New Roman" w:cs="Times New Roman" w:hint="eastAsia"/>
               </w:rPr>
-              <w:t>買家：希望直接聯繫賣家以詢問書</w:t>
-            </w:r>
-            <w:proofErr w:type="gramStart"/>
-            <w:r>
-              <w:rPr>
-                <w:rFonts w:ascii="Times New Roman" w:eastAsia="標楷體" w:hAnsi="Times New Roman" w:cs="Times New Roman" w:hint="eastAsia"/>
-              </w:rPr>
-              <w:t>況</w:t>
-            </w:r>
-            <w:proofErr w:type="gramEnd"/>
-            <w:r>
-              <w:rPr>
-                <w:rFonts w:ascii="Times New Roman" w:eastAsia="標楷體" w:hAnsi="Times New Roman" w:cs="Times New Roman" w:hint="eastAsia"/>
-              </w:rPr>
-              <w:t>細節或協商最終價格</w:t>
+              <w:t>買家：希望直接聯繫賣家以詢問書況細節或協商最終價格</w:t>
             </w:r>
           </w:p>
           <w:p>
@@ -4711,14 +4501,12 @@
               </w:rPr>
               <w:t>賣家</w:t>
             </w:r>
-            <w:proofErr w:type="gramStart"/>
             <w:r>
               <w:rPr>
                 <w:rFonts w:ascii="Times New Roman" w:eastAsia="標楷體" w:hAnsi="Times New Roman" w:cs="Times New Roman" w:hint="eastAsia"/>
               </w:rPr>
               <w:t>的私訊</w:t>
             </w:r>
-            <w:proofErr w:type="gramEnd"/>
             <w:r>
               <w:rPr>
                 <w:rFonts w:ascii="Times New Roman" w:eastAsia="標楷體" w:hAnsi="Times New Roman" w:cs="Times New Roman" w:hint="eastAsia"/>
@@ -4748,21 +4536,7 @@
               <w:rPr>
                 <w:rFonts w:ascii="Times New Roman" w:eastAsia="標楷體" w:hAnsi="Times New Roman" w:cs="Times New Roman" w:hint="eastAsia"/>
               </w:rPr>
-              <w:t>買家輸入諮詢內容</w:t>
-            </w:r>
-            <w:proofErr w:type="gramStart"/>
-            <w:r>
-              <w:rPr>
-                <w:rFonts w:ascii="Times New Roman" w:eastAsia="標楷體" w:hAnsi="Times New Roman" w:cs="Times New Roman" w:hint="eastAsia"/>
-              </w:rPr>
-              <w:t>（</w:t>
-            </w:r>
-            <w:proofErr w:type="gramEnd"/>
-            <w:r>
-              <w:rPr>
-                <w:rFonts w:ascii="Times New Roman" w:eastAsia="標楷體" w:hAnsi="Times New Roman" w:cs="Times New Roman" w:hint="eastAsia"/>
-              </w:rPr>
-              <w:t>如：詢問</w:t>
+              <w:t>買家輸入諮詢內容（如：詢問</w:t>
             </w:r>
             <w:r>
               <w:rPr>
@@ -4770,33 +4544,11 @@
               </w:rPr>
               <w:t>書</w:t>
             </w:r>
-            <w:proofErr w:type="gramStart"/>
-            <w:r>
-              <w:rPr>
-                <w:rFonts w:ascii="Times New Roman" w:eastAsia="標楷體" w:hAnsi="Times New Roman" w:cs="Times New Roman" w:hint="eastAsia"/>
-              </w:rPr>
-              <w:t>況</w:t>
-            </w:r>
-            <w:proofErr w:type="gramEnd"/>
-            <w:r>
-              <w:rPr>
-                <w:rFonts w:ascii="Times New Roman" w:eastAsia="標楷體" w:hAnsi="Times New Roman" w:cs="Times New Roman" w:hint="eastAsia"/>
-              </w:rPr>
-              <w:t>、議價或約定地點</w:t>
-            </w:r>
-            <w:proofErr w:type="gramStart"/>
-            <w:r>
-              <w:rPr>
-                <w:rFonts w:ascii="Times New Roman" w:eastAsia="標楷體" w:hAnsi="Times New Roman" w:cs="Times New Roman" w:hint="eastAsia"/>
-              </w:rPr>
-              <w:t>）</w:t>
-            </w:r>
-            <w:proofErr w:type="gramEnd"/>
-            <w:r>
-              <w:rPr>
-                <w:rFonts w:ascii="Times New Roman" w:eastAsia="標楷體" w:hAnsi="Times New Roman" w:cs="Times New Roman" w:hint="eastAsia"/>
-              </w:rPr>
-              <w:t>。</w:t>
+            <w:r>
+              <w:rPr>
+                <w:rFonts w:ascii="Times New Roman" w:eastAsia="標楷體" w:hAnsi="Times New Roman" w:cs="Times New Roman" w:hint="eastAsia"/>
+              </w:rPr>
+              <w:t>況、議價或約定地點）。</w:t>
             </w:r>
           </w:p>
           <w:p>
@@ -5021,21 +4773,7 @@
               <w:rPr>
                 <w:rFonts w:ascii="Times New Roman" w:eastAsia="標楷體" w:hAnsi="Times New Roman" w:cs="Times New Roman" w:hint="eastAsia"/>
               </w:rPr>
-              <w:t>支援文字訊息；未來可擴充支援圖片傳送（用於拍攝更詳細的書</w:t>
-            </w:r>
-            <w:proofErr w:type="gramStart"/>
-            <w:r>
-              <w:rPr>
-                <w:rFonts w:ascii="Times New Roman" w:eastAsia="標楷體" w:hAnsi="Times New Roman" w:cs="Times New Roman" w:hint="eastAsia"/>
-              </w:rPr>
-              <w:t>況</w:t>
-            </w:r>
-            <w:proofErr w:type="gramEnd"/>
-            <w:r>
-              <w:rPr>
-                <w:rFonts w:ascii="Times New Roman" w:eastAsia="標楷體" w:hAnsi="Times New Roman" w:cs="Times New Roman" w:hint="eastAsia"/>
-              </w:rPr>
-              <w:t>）。</w:t>
+              <w:t>支援文字訊息；未來可擴充支援圖片傳送（用於拍攝更詳細的書況）。</w:t>
             </w:r>
           </w:p>
         </w:tc>
@@ -5243,16 +4981,12 @@
                 <w:rFonts w:ascii="Times New Roman" w:eastAsia="標楷體" w:hAnsi="Times New Roman" w:cs="Times New Roman"/>
               </w:rPr>
             </w:pPr>
-            <w:proofErr w:type="spellStart"/>
-            <w:proofErr w:type="gramStart"/>
             <w:r>
               <w:rPr>
                 <w:rFonts w:ascii="Times New Roman" w:eastAsia="標楷體" w:hAnsi="Times New Roman" w:cs="Times New Roman" w:hint="eastAsia"/>
               </w:rPr>
               <w:t>Re:Book</w:t>
             </w:r>
-            <w:proofErr w:type="spellEnd"/>
-            <w:proofErr w:type="gramEnd"/>
           </w:p>
         </w:tc>
       </w:tr>
@@ -5544,14 +5278,7 @@
               <w:rPr>
                 <w:rFonts w:ascii="Times New Roman" w:eastAsia="標楷體" w:hAnsi="Times New Roman" w:cs="Times New Roman" w:hint="eastAsia"/>
               </w:rPr>
-              <w:t>被正確</w:t>
-            </w:r>
-            <w:proofErr w:type="gramStart"/>
-            <w:r>
-              <w:rPr>
-                <w:rFonts w:ascii="Times New Roman" w:eastAsia="標楷體" w:hAnsi="Times New Roman" w:cs="Times New Roman" w:hint="eastAsia"/>
-              </w:rPr>
-              <w:t>歸類至</w:t>
+              <w:t>被正確歸類至</w:t>
             </w:r>
             <w:r>
               <w:rPr>
@@ -5559,7 +5286,6 @@
               </w:rPr>
               <w:t>賣家</w:t>
             </w:r>
-            <w:proofErr w:type="gramEnd"/>
             <w:r>
               <w:rPr>
                 <w:rFonts w:ascii="Times New Roman" w:eastAsia="標楷體" w:hAnsi="Times New Roman" w:cs="Times New Roman" w:hint="eastAsia"/>
@@ -5576,21 +5302,7 @@
               <w:rPr>
                 <w:rFonts w:ascii="Times New Roman" w:eastAsia="標楷體" w:hAnsi="Times New Roman" w:cs="Times New Roman" w:hint="eastAsia"/>
               </w:rPr>
-              <w:t>分類中，且買家在賣家個人頁面能看到</w:t>
-            </w:r>
-            <w:proofErr w:type="gramStart"/>
-            <w:r>
-              <w:rPr>
-                <w:rFonts w:ascii="Times New Roman" w:eastAsia="標楷體" w:hAnsi="Times New Roman" w:cs="Times New Roman" w:hint="eastAsia"/>
-              </w:rPr>
-              <w:t>清楚的</w:t>
-            </w:r>
-            <w:proofErr w:type="gramEnd"/>
-            <w:r>
-              <w:rPr>
-                <w:rFonts w:ascii="Times New Roman" w:eastAsia="標楷體" w:hAnsi="Times New Roman" w:cs="Times New Roman" w:hint="eastAsia"/>
-              </w:rPr>
-              <w:t>分類結構。</w:t>
+              <w:t>分類中，且買家在賣家個人頁面能看到清楚的分類結構。</w:t>
             </w:r>
           </w:p>
         </w:tc>
@@ -6405,16 +6117,12 @@
                 <w:rFonts w:ascii="Times New Roman" w:eastAsia="標楷體" w:hAnsi="Times New Roman" w:cs="Times New Roman"/>
               </w:rPr>
             </w:pPr>
-            <w:proofErr w:type="spellStart"/>
-            <w:proofErr w:type="gramStart"/>
             <w:r>
               <w:rPr>
                 <w:rFonts w:ascii="Times New Roman" w:eastAsia="標楷體" w:hAnsi="Times New Roman" w:cs="Times New Roman"/>
               </w:rPr>
               <w:t>Re:Book</w:t>
             </w:r>
-            <w:proofErr w:type="spellEnd"/>
-            <w:proofErr w:type="gramEnd"/>
           </w:p>
         </w:tc>
       </w:tr>
@@ -6703,19 +6411,11 @@
               </w:rPr>
               <w:t>的</w:t>
             </w:r>
-            <w:proofErr w:type="gramStart"/>
-            <w:r>
-              <w:rPr>
-                <w:rFonts w:ascii="Times New Roman" w:eastAsia="標楷體" w:hAnsi="Times New Roman" w:cs="Times New Roman" w:hint="eastAsia"/>
-              </w:rPr>
-              <w:t>詳情頁點擊</w:t>
-            </w:r>
-            <w:proofErr w:type="gramEnd"/>
-            <w:r>
-              <w:rPr>
-                <w:rFonts w:ascii="Times New Roman" w:eastAsia="標楷體" w:hAnsi="Times New Roman" w:cs="Times New Roman" w:hint="eastAsia"/>
-              </w:rPr>
-              <w:t>「加入</w:t>
+            <w:r>
+              <w:rPr>
+                <w:rFonts w:ascii="Times New Roman" w:eastAsia="標楷體" w:hAnsi="Times New Roman" w:cs="Times New Roman" w:hint="eastAsia"/>
+              </w:rPr>
+              <w:t>詳情頁點擊「加入</w:t>
             </w:r>
             <w:r>
               <w:rPr>
@@ -6803,7 +6503,6 @@
               </w:rPr>
               <w:t>買家進入</w:t>
             </w:r>
-            <w:proofErr w:type="gramStart"/>
             <w:r>
               <w:rPr>
                 <w:rFonts w:ascii="Times New Roman" w:eastAsia="標楷體" w:hAnsi="Times New Roman" w:cs="Times New Roman" w:hint="eastAsia"/>
@@ -6814,14 +6513,7 @@
               <w:rPr>
                 <w:rFonts w:ascii="Times New Roman" w:eastAsia="標楷體" w:hAnsi="Times New Roman" w:cs="Times New Roman" w:hint="eastAsia"/>
               </w:rPr>
-              <w:t>頁面</w:t>
-            </w:r>
-            <w:proofErr w:type="gramEnd"/>
-            <w:r>
-              <w:rPr>
-                <w:rFonts w:ascii="Times New Roman" w:eastAsia="標楷體" w:hAnsi="Times New Roman" w:cs="Times New Roman" w:hint="eastAsia"/>
-              </w:rPr>
-              <w:t>，查看所有已</w:t>
+              <w:t>頁面，查看所有已</w:t>
             </w:r>
             <w:r>
               <w:rPr>
@@ -6866,14 +6558,12 @@
               </w:rPr>
               <w:t>買家可從</w:t>
             </w:r>
-            <w:proofErr w:type="gramStart"/>
             <w:r>
               <w:rPr>
                 <w:rFonts w:ascii="Times New Roman" w:eastAsia="標楷體" w:hAnsi="Times New Roman" w:cs="Times New Roman" w:hint="eastAsia"/>
               </w:rPr>
               <w:t>購物車頁面</w:t>
             </w:r>
-            <w:proofErr w:type="gramEnd"/>
             <w:r>
               <w:rPr>
                 <w:rFonts w:ascii="Times New Roman" w:eastAsia="標楷體" w:hAnsi="Times New Roman" w:cs="Times New Roman" w:hint="eastAsia"/>
@@ -7581,19 +7271,11 @@
                 <w:rFonts w:ascii="Times New Roman" w:eastAsia="標楷體" w:hAnsi="Times New Roman" w:cs="Times New Roman"/>
               </w:rPr>
             </w:pPr>
-            <w:proofErr w:type="gramStart"/>
-            <w:r>
-              <w:rPr>
-                <w:rFonts w:ascii="Times New Roman" w:eastAsia="標楷體" w:hAnsi="Times New Roman" w:cs="Times New Roman" w:hint="eastAsia"/>
-              </w:rPr>
-              <w:t>私訊傳遞</w:t>
-            </w:r>
-            <w:proofErr w:type="gramEnd"/>
-            <w:r>
-              <w:rPr>
-                <w:rFonts w:ascii="Times New Roman" w:eastAsia="標楷體" w:hAnsi="Times New Roman" w:cs="Times New Roman" w:hint="eastAsia"/>
-              </w:rPr>
-              <w:t>的延遲時間應小於</w:t>
+            <w:r>
+              <w:rPr>
+                <w:rFonts w:ascii="Times New Roman" w:eastAsia="標楷體" w:hAnsi="Times New Roman" w:cs="Times New Roman" w:hint="eastAsia"/>
+              </w:rPr>
+              <w:t>私訊傳遞的延遲時間應小於</w:t>
             </w:r>
             <w:r>
               <w:rPr>
@@ -8113,21 +7795,7 @@
               <w:rPr>
                 <w:rFonts w:ascii="Times New Roman" w:eastAsia="標楷體" w:hAnsi="Times New Roman" w:cs="Times New Roman"/>
               </w:rPr>
-              <w:t>，包含該書籍的價格、書</w:t>
-            </w:r>
-            <w:proofErr w:type="gramStart"/>
-            <w:r>
-              <w:rPr>
-                <w:rFonts w:ascii="Times New Roman" w:eastAsia="標楷體" w:hAnsi="Times New Roman" w:cs="Times New Roman"/>
-              </w:rPr>
-              <w:t>況</w:t>
-            </w:r>
-            <w:proofErr w:type="gramEnd"/>
-            <w:r>
-              <w:rPr>
-                <w:rFonts w:ascii="Times New Roman" w:eastAsia="標楷體" w:hAnsi="Times New Roman" w:cs="Times New Roman"/>
-              </w:rPr>
-              <w:t>、照片與所在地點等資訊。</w:t>
+              <w:t>，包含該書籍的價格、書況、照片與所在地點等資訊。</w:t>
             </w:r>
           </w:p>
         </w:tc>
@@ -8231,14 +7899,12 @@
                 <w:rFonts w:ascii="Times New Roman" w:eastAsia="標楷體" w:hAnsi="Times New Roman" w:cs="Times New Roman"/>
               </w:rPr>
             </w:pPr>
-            <w:proofErr w:type="gramStart"/>
             <w:r>
               <w:rPr>
                 <w:rFonts w:ascii="Times New Roman" w:eastAsia="標楷體" w:hAnsi="Times New Roman" w:cs="Times New Roman" w:hint="eastAsia"/>
               </w:rPr>
               <w:t>私訊</w:t>
             </w:r>
-            <w:proofErr w:type="gramEnd"/>
           </w:p>
         </w:tc>
         <w:tc>
@@ -8305,21 +7971,7 @@
               <w:rPr>
                 <w:rFonts w:ascii="Times New Roman" w:eastAsia="標楷體" w:hAnsi="Times New Roman" w:cs="Times New Roman" w:hint="eastAsia"/>
               </w:rPr>
-              <w:t>。讓買家在後續可以進行比價或</w:t>
-            </w:r>
-            <w:proofErr w:type="gramStart"/>
-            <w:r>
-              <w:rPr>
-                <w:rFonts w:ascii="Times New Roman" w:eastAsia="標楷體" w:hAnsi="Times New Roman" w:cs="Times New Roman" w:hint="eastAsia"/>
-              </w:rPr>
-              <w:t>發起私訊以</w:t>
-            </w:r>
-            <w:proofErr w:type="gramEnd"/>
-            <w:r>
-              <w:rPr>
-                <w:rFonts w:ascii="Times New Roman" w:eastAsia="標楷體" w:hAnsi="Times New Roman" w:cs="Times New Roman" w:hint="eastAsia"/>
-              </w:rPr>
-              <w:t>進行協商。</w:t>
+              <w:t>。讓買家在後續可以進行比價或發起私訊以進行協商。</w:t>
             </w:r>
           </w:p>
         </w:tc>
@@ -8738,14 +8390,12 @@
                 <w:rFonts w:ascii="Times New Roman" w:eastAsia="標楷體" w:hAnsi="Times New Roman" w:cs="Times New Roman"/>
               </w:rPr>
             </w:pPr>
-            <w:proofErr w:type="gramStart"/>
             <w:r>
               <w:rPr>
                 <w:rFonts w:ascii="Times New Roman" w:eastAsia="標楷體" w:hAnsi="Times New Roman" w:cs="Times New Roman" w:hint="eastAsia"/>
               </w:rPr>
               <w:t>必填欄位</w:t>
             </w:r>
-            <w:proofErr w:type="gramEnd"/>
           </w:p>
         </w:tc>
       </w:tr>
@@ -8782,16 +8432,8 @@
               <w:rPr>
                 <w:rFonts w:ascii="Times New Roman" w:eastAsia="標楷體" w:hAnsi="Times New Roman" w:cs="Times New Roman" w:hint="eastAsia"/>
               </w:rPr>
-              <w:t>書</w:t>
-            </w:r>
-            <w:proofErr w:type="gramStart"/>
-            <w:r>
-              <w:rPr>
-                <w:rFonts w:ascii="Times New Roman" w:eastAsia="標楷體" w:hAnsi="Times New Roman" w:cs="Times New Roman" w:hint="eastAsia"/>
-              </w:rPr>
-              <w:t>況</w:t>
-            </w:r>
-            <w:proofErr w:type="gramEnd"/>
+              <w:t>書況</w:t>
+            </w:r>
           </w:p>
         </w:tc>
         <w:tc>
@@ -8840,14 +8482,12 @@
                 <w:rFonts w:ascii="Times New Roman" w:eastAsia="標楷體" w:hAnsi="Times New Roman" w:cs="Times New Roman"/>
               </w:rPr>
             </w:pPr>
-            <w:proofErr w:type="gramStart"/>
             <w:r>
               <w:rPr>
                 <w:rFonts w:ascii="Times New Roman" w:eastAsia="標楷體" w:hAnsi="Times New Roman" w:cs="Times New Roman" w:hint="eastAsia"/>
               </w:rPr>
               <w:t>私訊</w:t>
             </w:r>
-            <w:proofErr w:type="gramEnd"/>
           </w:p>
         </w:tc>
       </w:tr>
@@ -9082,14 +8722,12 @@
                 <w:rFonts w:ascii="Times New Roman" w:eastAsia="標楷體" w:hAnsi="Times New Roman" w:cs="Times New Roman"/>
               </w:rPr>
             </w:pPr>
-            <w:proofErr w:type="gramStart"/>
             <w:r>
               <w:rPr>
                 <w:rFonts w:ascii="Times New Roman" w:eastAsia="標楷體" w:hAnsi="Times New Roman" w:cs="Times New Roman" w:hint="eastAsia"/>
               </w:rPr>
               <w:t>購物車頁面</w:t>
             </w:r>
-            <w:proofErr w:type="gramEnd"/>
           </w:p>
         </w:tc>
         <w:tc>
@@ -9230,21 +8868,7 @@
         <w:rPr>
           <w:rFonts w:ascii="Times New Roman" w:eastAsia="標楷體" w:hAnsi="Times New Roman" w:cs="Times New Roman" w:hint="eastAsia"/>
         </w:rPr>
-        <w:t>書籍頁面、個人賣場管理頁面、</w:t>
-      </w:r>
-      <w:proofErr w:type="gramStart"/>
-      <w:r>
-        <w:rPr>
-          <w:rFonts w:ascii="Times New Roman" w:eastAsia="標楷體" w:hAnsi="Times New Roman" w:cs="Times New Roman" w:hint="eastAsia"/>
-        </w:rPr>
-        <w:t>購物車頁面</w:t>
-      </w:r>
-      <w:proofErr w:type="gramEnd"/>
-      <w:r>
-        <w:rPr>
-          <w:rFonts w:ascii="Times New Roman" w:eastAsia="標楷體" w:hAnsi="Times New Roman" w:cs="Times New Roman" w:hint="eastAsia"/>
-        </w:rPr>
-        <w:t>：皆為前端</w:t>
+        <w:t>書籍頁面、個人賣場管理頁面、購物車頁面：皆為前端</w:t>
       </w:r>
       <w:r>
         <w:rPr>
@@ -9336,19 +8960,11 @@
           <w:rFonts w:ascii="Times New Roman" w:eastAsia="標楷體" w:hAnsi="Times New Roman" w:cs="Times New Roman"/>
         </w:rPr>
       </w:pPr>
-      <w:proofErr w:type="gramStart"/>
       <w:r>
         <w:rPr>
           <w:rFonts w:ascii="Times New Roman" w:eastAsia="標楷體" w:hAnsi="Times New Roman" w:cs="Times New Roman" w:hint="eastAsia"/>
         </w:rPr>
-        <w:t>必填欄位</w:t>
-      </w:r>
-      <w:proofErr w:type="gramEnd"/>
-      <w:r>
-        <w:rPr>
-          <w:rFonts w:ascii="Times New Roman" w:eastAsia="標楷體" w:hAnsi="Times New Roman" w:cs="Times New Roman" w:hint="eastAsia"/>
-        </w:rPr>
-        <w:t>：表單驗證規則，非實體物件。</w:t>
+        <w:t>必填欄位：表單驗證規則，非實體物件。</w:t>
       </w:r>
     </w:p>
     <w:p>
@@ -9409,21 +9025,7 @@
         <w:rPr>
           <w:rFonts w:ascii="Times New Roman" w:eastAsia="標楷體" w:hAnsi="Times New Roman" w:cs="Times New Roman" w:hint="eastAsia"/>
         </w:rPr>
-        <w:t>書籍狀態、書</w:t>
-      </w:r>
-      <w:proofErr w:type="gramStart"/>
-      <w:r>
-        <w:rPr>
-          <w:rFonts w:ascii="Times New Roman" w:eastAsia="標楷體" w:hAnsi="Times New Roman" w:cs="Times New Roman" w:hint="eastAsia"/>
-        </w:rPr>
-        <w:t>況</w:t>
-      </w:r>
-      <w:proofErr w:type="gramEnd"/>
-      <w:r>
-        <w:rPr>
-          <w:rFonts w:ascii="Times New Roman" w:eastAsia="標楷體" w:hAnsi="Times New Roman" w:cs="Times New Roman" w:hint="eastAsia"/>
-        </w:rPr>
-        <w:t>：應作為</w:t>
+        <w:t>書籍狀態、書況：應作為</w:t>
       </w:r>
       <w:r>
         <w:rPr>
@@ -9952,14 +9554,12 @@
                 <w:rFonts w:ascii="Times New Roman" w:eastAsia="標楷體" w:hAnsi="Times New Roman" w:cs="Times New Roman"/>
               </w:rPr>
             </w:pPr>
-            <w:proofErr w:type="gramStart"/>
             <w:r>
               <w:rPr>
                 <w:rFonts w:ascii="Times New Roman" w:eastAsia="標楷體" w:hAnsi="Times New Roman" w:cs="Times New Roman" w:hint="eastAsia"/>
               </w:rPr>
               <w:t>私訊</w:t>
             </w:r>
-            <w:proofErr w:type="gramEnd"/>
           </w:p>
         </w:tc>
         <w:tc>
@@ -10045,14 +9645,12 @@
         </w:rPr>
         <w:t>class</w:t>
       </w:r>
-      <w:proofErr w:type="gramStart"/>
       <w:r>
         <w:rPr>
           <w:rFonts w:ascii="Times New Roman" w:eastAsia="標楷體" w:hAnsi="Times New Roman" w:cs="Times New Roman" w:hint="eastAsia"/>
         </w:rPr>
         <w:t>—</w:t>
       </w:r>
-      <w:proofErr w:type="gramEnd"/>
       <w:r>
         <w:rPr>
           <w:rFonts w:ascii="Times New Roman" w:eastAsia="標楷體" w:hAnsi="Times New Roman" w:cs="Times New Roman" w:hint="eastAsia"/>
@@ -10262,21 +9860,7 @@
               <w:rPr>
                 <w:rFonts w:ascii="Times New Roman" w:eastAsia="標楷體" w:hAnsi="Times New Roman" w:cs="Times New Roman" w:hint="eastAsia"/>
               </w:rPr>
-              <w:t xml:space="preserve"> (</w:t>
-            </w:r>
-            <w:proofErr w:type="spellStart"/>
-            <w:r>
-              <w:rPr>
-                <w:rFonts w:ascii="Times New Roman" w:eastAsia="標楷體" w:hAnsi="Times New Roman" w:cs="Times New Roman" w:hint="eastAsia"/>
-              </w:rPr>
-              <w:t>BookInfo</w:t>
-            </w:r>
-            <w:proofErr w:type="spellEnd"/>
-            <w:r>
-              <w:rPr>
-                <w:rFonts w:ascii="Times New Roman" w:eastAsia="標楷體" w:hAnsi="Times New Roman" w:cs="Times New Roman" w:hint="eastAsia"/>
-              </w:rPr>
-              <w:t>)</w:t>
+              <w:t xml:space="preserve"> (BookInfo)</w:t>
             </w:r>
           </w:p>
         </w:tc>
@@ -10314,14 +9898,12 @@
                 <w:rFonts w:ascii="Times New Roman" w:eastAsia="標楷體" w:hAnsi="Times New Roman" w:cs="Times New Roman"/>
               </w:rPr>
             </w:pPr>
-            <w:proofErr w:type="gramStart"/>
             <w:r>
               <w:rPr>
                 <w:rFonts w:ascii="Times New Roman" w:eastAsia="標楷體" w:hAnsi="Times New Roman" w:cs="Times New Roman" w:hint="eastAsia"/>
               </w:rPr>
               <w:t>私訊</w:t>
             </w:r>
-            <w:proofErr w:type="gramEnd"/>
             <w:r>
               <w:rPr>
                 <w:rFonts w:ascii="Times New Roman" w:eastAsia="標楷體" w:hAnsi="Times New Roman" w:cs="Times New Roman" w:hint="eastAsia"/>
@@ -10434,14 +10016,13 @@
       </w:pPr>
       <w:r>
         <w:rPr>
-          <w:rFonts w:ascii="Times New Roman" w:eastAsia="標楷體" w:hAnsi="Times New Roman" w:cs="Times New Roman"/>
           <w:noProof/>
         </w:rPr>
         <w:drawing>
-          <wp:inline distT="0" distB="0" distL="0" distR="0" wp14:anchorId="5AA8504B" wp14:editId="60E92F39">
-            <wp:extent cx="4514502" cy="5067300"/>
-            <wp:effectExtent l="0" t="0" r="635" b="0"/>
-            <wp:docPr id="2" name="圖片 2"/>
+          <wp:inline distT="0" distB="0" distL="0" distR="0" wp14:anchorId="5BE1C169" wp14:editId="6F9F7EFC">
+            <wp:extent cx="5274310" cy="5931535"/>
+            <wp:effectExtent l="0" t="0" r="2540" b="0"/>
+            <wp:docPr id="1" name="圖片 1"/>
             <wp:cNvGraphicFramePr>
               <a:graphicFrameLocks xmlns:a="http://schemas.openxmlformats.org/drawingml/2006/main" noChangeAspect="1"/>
             </wp:cNvGraphicFramePr>
@@ -10449,13 +10030,13 @@
               <a:graphicData uri="http://schemas.openxmlformats.org/drawingml/2006/picture">
                 <pic:pic xmlns:pic="http://schemas.openxmlformats.org/drawingml/2006/picture">
                   <pic:nvPicPr>
-                    <pic:cNvPr id="0" name="Picture 6"/>
+                    <pic:cNvPr id="0" name="Picture 1"/>
                     <pic:cNvPicPr>
                       <a:picLocks noChangeAspect="1" noChangeArrowheads="1"/>
                     </pic:cNvPicPr>
                   </pic:nvPicPr>
                   <pic:blipFill>
-                    <a:blip r:embed="rId9" cstate="print">
+                    <a:blip r:embed="rId9">
                       <a:extLst>
                         <a:ext uri="{28A0092B-C50C-407E-A947-70E740481C1C}">
                           <a14:useLocalDpi xmlns:a14="http://schemas.microsoft.com/office/drawing/2010/main" val="0"/>
@@ -10470,7 +10051,7 @@
                   <pic:spPr bwMode="auto">
                     <a:xfrm>
                       <a:off x="0" y="0"/>
-                      <a:ext cx="4532616" cy="5087632"/>
+                      <a:ext cx="5274310" cy="5931535"/>
                     </a:xfrm>
                     <a:prstGeom prst="rect">
                       <a:avLst/>
@@ -10546,10 +10127,10 @@
           <w:noProof/>
         </w:rPr>
         <w:drawing>
-          <wp:inline distT="0" distB="0" distL="0" distR="0" wp14:anchorId="49A9932D" wp14:editId="16980449">
-            <wp:extent cx="4519864" cy="5257800"/>
-            <wp:effectExtent l="0" t="0" r="0" b="0"/>
-            <wp:docPr id="5" name="圖片 5"/>
+          <wp:inline distT="0" distB="0" distL="0" distR="0" wp14:anchorId="4813A929" wp14:editId="0E7BFC74">
+            <wp:extent cx="5274310" cy="6175375"/>
+            <wp:effectExtent l="0" t="0" r="2540" b="0"/>
+            <wp:docPr id="3" name="圖片 3"/>
             <wp:cNvGraphicFramePr>
               <a:graphicFrameLocks xmlns:a="http://schemas.openxmlformats.org/drawingml/2006/main" noChangeAspect="1"/>
             </wp:cNvGraphicFramePr>
@@ -10557,13 +10138,13 @@
               <a:graphicData uri="http://schemas.openxmlformats.org/drawingml/2006/picture">
                 <pic:pic xmlns:pic="http://schemas.openxmlformats.org/drawingml/2006/picture">
                   <pic:nvPicPr>
-                    <pic:cNvPr id="0" name="Picture 13"/>
+                    <pic:cNvPr id="0" name="Picture 3"/>
                     <pic:cNvPicPr>
                       <a:picLocks noChangeAspect="1" noChangeArrowheads="1"/>
                     </pic:cNvPicPr>
                   </pic:nvPicPr>
                   <pic:blipFill>
-                    <a:blip r:embed="rId10" cstate="print">
+                    <a:blip r:embed="rId10">
                       <a:extLst>
                         <a:ext uri="{28A0092B-C50C-407E-A947-70E740481C1C}">
                           <a14:useLocalDpi xmlns:a14="http://schemas.microsoft.com/office/drawing/2010/main" val="0"/>
@@ -10578,7 +10159,7 @@
                   <pic:spPr bwMode="auto">
                     <a:xfrm>
                       <a:off x="0" y="0"/>
-                      <a:ext cx="4533757" cy="5273961"/>
+                      <a:ext cx="5274310" cy="6175375"/>
                     </a:xfrm>
                     <a:prstGeom prst="rect">
                       <a:avLst/>
@@ -10668,15 +10249,6 @@
         </w:rPr>
         <w:t>ttributes</w:t>
       </w:r>
-    </w:p>
-    <w:p>
-      <w:pPr>
-        <w:rPr>
-          <w:rFonts w:ascii="Times New Roman" w:eastAsia="標楷體" w:hAnsi="Times New Roman" w:cs="Times New Roman"/>
-          <w:sz w:val="22"/>
-          <w:szCs w:val="22"/>
-        </w:rPr>
-      </w:pPr>
     </w:p>
     <w:p>
       <w:pPr>
@@ -11948,6 +11520,83 @@
           <w:tcPr>
             <w:tcW w:w="1189" w:type="dxa"/>
             <w:vMerge/>
+          </w:tcPr>
+          <w:p>
+            <w:pPr>
+              <w:rPr>
+                <w:rFonts w:ascii="Times New Roman" w:eastAsia="標楷體" w:hAnsi="Times New Roman" w:cs="Times New Roman"/>
+              </w:rPr>
+            </w:pPr>
+          </w:p>
+        </w:tc>
+      </w:tr>
+      <w:tr>
+        <w:trPr>
+          <w:trHeight w:val="336"/>
+        </w:trPr>
+        <w:tc>
+          <w:tcPr>
+            <w:tcW w:w="1877" w:type="dxa"/>
+          </w:tcPr>
+          <w:p>
+            <w:pPr>
+              <w:rPr>
+                <w:rFonts w:ascii="Times New Roman" w:eastAsia="標楷體" w:hAnsi="Times New Roman" w:cs="Times New Roman" w:hint="eastAsia"/>
+              </w:rPr>
+            </w:pPr>
+            <w:r>
+              <w:rPr>
+                <w:rFonts w:ascii="Times New Roman" w:eastAsia="標楷體" w:hAnsi="Times New Roman" w:cs="Times New Roman" w:hint="eastAsia"/>
+              </w:rPr>
+              <w:t>HW#6</w:t>
+            </w:r>
+          </w:p>
+        </w:tc>
+        <w:tc>
+          <w:tcPr>
+            <w:tcW w:w="3829" w:type="dxa"/>
+          </w:tcPr>
+          <w:p>
+            <w:pPr>
+              <w:rPr>
+                <w:rFonts w:ascii="Times New Roman" w:eastAsia="標楷體" w:hAnsi="Times New Roman" w:cs="Times New Roman" w:hint="eastAsia"/>
+              </w:rPr>
+            </w:pPr>
+            <w:r>
+              <w:rPr>
+                <w:rFonts w:ascii="Times New Roman" w:eastAsia="標楷體" w:hAnsi="Times New Roman" w:cs="Times New Roman" w:hint="eastAsia"/>
+              </w:rPr>
+              <w:t>26/05/25 09:30~</w:t>
+            </w:r>
+            <w:r>
+              <w:rPr>
+                <w:rFonts w:ascii="Times New Roman" w:eastAsia="標楷體" w:hAnsi="Times New Roman" w:cs="Times New Roman" w:hint="eastAsia"/>
+              </w:rPr>
+              <w:t>10:30</w:t>
+            </w:r>
+          </w:p>
+        </w:tc>
+        <w:tc>
+          <w:tcPr>
+            <w:tcW w:w="1350" w:type="dxa"/>
+          </w:tcPr>
+          <w:p>
+            <w:pPr>
+              <w:rPr>
+                <w:rFonts w:ascii="Times New Roman" w:eastAsia="標楷體" w:hAnsi="Times New Roman" w:cs="Times New Roman"/>
+              </w:rPr>
+            </w:pPr>
+            <w:r>
+              <w:rPr>
+                <w:rFonts w:ascii="Times New Roman" w:eastAsia="標楷體" w:hAnsi="Times New Roman" w:cs="Times New Roman" w:hint="eastAsia"/>
+              </w:rPr>
+              <w:t>1h</w:t>
+            </w:r>
+          </w:p>
+        </w:tc>
+        <w:tc>
+          <w:tcPr>
+            <w:tcW w:w="1189" w:type="dxa"/>
           </w:tcPr>
           <w:p>
             <w:pPr>

</xml_diff>

<commit_message>
doc: modify `Domain Model` and add info to `Change History`
</commit_message>
<xml_diff>
--- a/document/hw6.docx
+++ b/document/hw6.docx
@@ -83,6 +83,7 @@
           <w:szCs w:val="52"/>
         </w:rPr>
       </w:pPr>
+      <w:proofErr w:type="spellStart"/>
       <w:r>
         <w:rPr>
           <w:rFonts w:ascii="Times New Roman" w:eastAsia="標楷體" w:hAnsi="Times New Roman" w:cs="Times New Roman" w:hint="eastAsia"/>
@@ -93,6 +94,7 @@
         </w:rPr>
         <w:t>Re:Book</w:t>
       </w:r>
+      <w:proofErr w:type="spellEnd"/>
     </w:p>
     <w:p>
       <w:pPr>
@@ -791,6 +793,113 @@
           </w:p>
         </w:tc>
       </w:tr>
+      <w:tr>
+        <w:tc>
+          <w:tcPr>
+            <w:tcW w:w="8296" w:type="dxa"/>
+            <w:gridSpan w:val="3"/>
+          </w:tcPr>
+          <w:p>
+            <w:pPr>
+              <w:rPr>
+                <w:rFonts w:ascii="Times New Roman" w:eastAsia="標楷體" w:hAnsi="Times New Roman" w:cs="Times New Roman" w:hint="eastAsia"/>
+              </w:rPr>
+            </w:pPr>
+            <w:r>
+              <w:rPr>
+                <w:rFonts w:ascii="Times New Roman" w:hAnsi="Times New Roman" w:cs="Times New Roman"/>
+              </w:rPr>
+              <w:t xml:space="preserve">Iteration </w:t>
+            </w:r>
+            <w:r>
+              <w:rPr>
+                <w:rFonts w:ascii="Times New Roman" w:hAnsi="Times New Roman" w:cs="Times New Roman" w:hint="eastAsia"/>
+              </w:rPr>
+              <w:t>2</w:t>
+            </w:r>
+          </w:p>
+        </w:tc>
+      </w:tr>
+      <w:tr>
+        <w:tc>
+          <w:tcPr>
+            <w:tcW w:w="990" w:type="dxa"/>
+          </w:tcPr>
+          <w:p>
+            <w:pPr>
+              <w:rPr>
+                <w:rFonts w:ascii="Times New Roman" w:hAnsi="Times New Roman" w:cs="Times New Roman" w:hint="eastAsia"/>
+              </w:rPr>
+            </w:pPr>
+            <w:r>
+              <w:rPr>
+                <w:rFonts w:ascii="Times New Roman" w:hAnsi="Times New Roman" w:cs="Times New Roman" w:hint="eastAsia"/>
+              </w:rPr>
+              <w:t>7</w:t>
+            </w:r>
+          </w:p>
+        </w:tc>
+        <w:tc>
+          <w:tcPr>
+            <w:tcW w:w="5384" w:type="dxa"/>
+          </w:tcPr>
+          <w:p>
+            <w:pPr>
+              <w:rPr>
+                <w:rFonts w:ascii="Times New Roman" w:hAnsi="Times New Roman" w:cs="Times New Roman" w:hint="eastAsia"/>
+              </w:rPr>
+            </w:pPr>
+            <w:r>
+              <w:rPr>
+                <w:rFonts w:ascii="Times New Roman" w:hAnsi="Times New Roman" w:cs="Times New Roman"/>
+              </w:rPr>
+              <w:t>Use cases, Non-functional requirements</w:t>
+            </w:r>
+            <w:r>
+              <w:rPr>
+                <w:rFonts w:ascii="Times New Roman" w:hAnsi="Times New Roman" w:cs="Times New Roman" w:hint="eastAsia"/>
+              </w:rPr>
+              <w:t xml:space="preserve">, </w:t>
+            </w:r>
+            <w:r>
+              <w:rPr>
+                <w:rFonts w:ascii="Times New Roman" w:hAnsi="Times New Roman" w:cs="Times New Roman"/>
+              </w:rPr>
+              <w:t>Glossary</w:t>
+            </w:r>
+            <w:r>
+              <w:rPr>
+                <w:rFonts w:ascii="Times New Roman" w:hAnsi="Times New Roman" w:cs="Times New Roman" w:hint="eastAsia"/>
+              </w:rPr>
+              <w:t xml:space="preserve">, </w:t>
+            </w:r>
+            <w:r>
+              <w:rPr>
+                <w:rFonts w:ascii="Times New Roman" w:hAnsi="Times New Roman" w:cs="Times New Roman" w:hint="eastAsia"/>
+              </w:rPr>
+              <w:t>Domain model</w:t>
+            </w:r>
+          </w:p>
+        </w:tc>
+        <w:tc>
+          <w:tcPr>
+            <w:tcW w:w="1922" w:type="dxa"/>
+          </w:tcPr>
+          <w:p>
+            <w:pPr>
+              <w:rPr>
+                <w:rFonts w:ascii="Times New Roman" w:eastAsia="標楷體" w:hAnsi="Times New Roman" w:cs="Times New Roman" w:hint="eastAsia"/>
+              </w:rPr>
+            </w:pPr>
+            <w:r>
+              <w:rPr>
+                <w:rFonts w:ascii="Times New Roman" w:eastAsia="標楷體" w:hAnsi="Times New Roman" w:cs="Times New Roman" w:hint="eastAsia"/>
+              </w:rPr>
+              <w:t>2026/05/27</w:t>
+            </w:r>
+          </w:p>
+        </w:tc>
+      </w:tr>
     </w:tbl>
     <w:p/>
     <w:p>
@@ -813,11 +922,19 @@
           <w:rFonts w:ascii="Times New Roman" w:eastAsia="標楷體" w:hAnsi="Times New Roman" w:cs="Times New Roman"/>
         </w:rPr>
       </w:pPr>
+      <w:proofErr w:type="spellStart"/>
       <w:r>
         <w:rPr>
           <w:rFonts w:ascii="Times New Roman" w:eastAsia="標楷體" w:hAnsi="Times New Roman" w:cs="Times New Roman" w:hint="eastAsia"/>
         </w:rPr>
-        <w:t xml:space="preserve">Re:Book </w:t>
+        <w:t>Re:Book</w:t>
+      </w:r>
+      <w:proofErr w:type="spellEnd"/>
+      <w:r>
+        <w:rPr>
+          <w:rFonts w:ascii="Times New Roman" w:eastAsia="標楷體" w:hAnsi="Times New Roman" w:cs="Times New Roman" w:hint="eastAsia"/>
+        </w:rPr>
+        <w:t xml:space="preserve"> </w:t>
       </w:r>
       <w:r>
         <w:rPr>
@@ -844,11 +961,19 @@
           <w:rFonts w:ascii="Times New Roman" w:eastAsia="標楷體" w:hAnsi="Times New Roman" w:cs="Times New Roman"/>
         </w:rPr>
       </w:pPr>
+      <w:proofErr w:type="spellStart"/>
       <w:r>
         <w:rPr>
           <w:rFonts w:ascii="Times New Roman" w:eastAsia="標楷體" w:hAnsi="Times New Roman" w:cs="Times New Roman" w:hint="eastAsia"/>
         </w:rPr>
-        <w:t xml:space="preserve">Re:Book </w:t>
+        <w:t>Re:Book</w:t>
+      </w:r>
+      <w:proofErr w:type="spellEnd"/>
+      <w:r>
+        <w:rPr>
+          <w:rFonts w:ascii="Times New Roman" w:eastAsia="標楷體" w:hAnsi="Times New Roman" w:cs="Times New Roman" w:hint="eastAsia"/>
+        </w:rPr>
+        <w:t xml:space="preserve"> </w:t>
       </w:r>
       <w:r>
         <w:rPr>
@@ -896,6 +1021,7 @@
         <w:rPr>
           <w:rFonts w:hint="eastAsia"/>
         </w:rPr>
+        <w:lastRenderedPageBreak/>
         <w:t xml:space="preserve">1.3 </w:t>
       </w:r>
       <w:r>
@@ -977,7 +1103,6 @@
               <w:rPr>
                 <w:rFonts w:ascii="Times New Roman" w:eastAsia="標楷體" w:hAnsi="Times New Roman" w:cs="Times New Roman" w:hint="eastAsia"/>
               </w:rPr>
-              <w:lastRenderedPageBreak/>
               <w:t>FEA-01</w:t>
             </w:r>
           </w:p>
@@ -1317,6 +1442,7 @@
         <w:rPr>
           <w:rFonts w:hint="eastAsia"/>
         </w:rPr>
+        <w:lastRenderedPageBreak/>
         <w:t xml:space="preserve">1.5 </w:t>
       </w:r>
       <w:r>
@@ -1417,12 +1543,14 @@
                 <w:rFonts w:ascii="Times New Roman" w:eastAsia="標楷體" w:hAnsi="Times New Roman" w:cs="Times New Roman"/>
               </w:rPr>
             </w:pPr>
+            <w:proofErr w:type="spellStart"/>
             <w:r>
               <w:rPr>
                 <w:rFonts w:ascii="Times New Roman" w:eastAsia="標楷體" w:hAnsi="Times New Roman" w:cs="Times New Roman" w:hint="eastAsia"/>
               </w:rPr>
               <w:t>Re:Book</w:t>
             </w:r>
+            <w:proofErr w:type="spellEnd"/>
           </w:p>
         </w:tc>
       </w:tr>
@@ -1441,7 +1569,6 @@
               <w:rPr>
                 <w:rFonts w:ascii="Times New Roman" w:eastAsia="標楷體" w:hAnsi="Times New Roman" w:cs="Times New Roman" w:hint="eastAsia"/>
               </w:rPr>
-              <w:lastRenderedPageBreak/>
               <w:t>Level</w:t>
             </w:r>
           </w:p>
@@ -2190,7 +2317,14 @@
               <w:rPr>
                 <w:rFonts w:ascii="Times New Roman" w:eastAsia="標楷體" w:hAnsi="Times New Roman" w:cs="Times New Roman"/>
               </w:rPr>
-              <w:t>重新載入清單，顯示最新狀態</w:t>
+              <w:t>重新載入清單，顯示最新狀</w:t>
+            </w:r>
+            <w:r>
+              <w:rPr>
+                <w:rFonts w:ascii="Times New Roman" w:eastAsia="標楷體" w:hAnsi="Times New Roman" w:cs="Times New Roman"/>
+              </w:rPr>
+              <w:lastRenderedPageBreak/>
+              <w:t>態</w:t>
             </w:r>
             <w:r>
               <w:rPr>
@@ -2290,6 +2424,7 @@
               <w:rPr>
                 <w:rFonts w:ascii="Times New Roman" w:eastAsia="標楷體" w:hAnsi="Times New Roman" w:cs="Times New Roman" w:hint="eastAsia"/>
               </w:rPr>
+              <w:lastRenderedPageBreak/>
               <w:t>Special Re</w:t>
             </w:r>
             <w:r>
@@ -2384,7 +2519,6 @@
               <w:rPr>
                 <w:rFonts w:ascii="Times New Roman" w:eastAsia="標楷體" w:hAnsi="Times New Roman" w:cs="Times New Roman" w:hint="eastAsia"/>
               </w:rPr>
-              <w:lastRenderedPageBreak/>
               <w:t>Frequency of Occurrence</w:t>
             </w:r>
           </w:p>
@@ -2548,12 +2682,14 @@
                 <w:rFonts w:ascii="Times New Roman" w:eastAsia="標楷體" w:hAnsi="Times New Roman" w:cs="Times New Roman"/>
               </w:rPr>
             </w:pPr>
+            <w:proofErr w:type="spellStart"/>
             <w:r>
               <w:rPr>
                 <w:rFonts w:ascii="Times New Roman" w:eastAsia="標楷體" w:hAnsi="Times New Roman" w:cs="Times New Roman" w:hint="eastAsia"/>
               </w:rPr>
               <w:t>Re:Book</w:t>
             </w:r>
+            <w:proofErr w:type="spellEnd"/>
           </w:p>
         </w:tc>
       </w:tr>
@@ -3054,6 +3190,7 @@
               <w:rPr>
                 <w:rFonts w:ascii="Times New Roman" w:eastAsia="標楷體" w:hAnsi="Times New Roman" w:cs="Times New Roman" w:hint="eastAsia"/>
               </w:rPr>
+              <w:lastRenderedPageBreak/>
               <w:t>Special Requirements</w:t>
             </w:r>
           </w:p>
@@ -3231,7 +3368,6 @@
         <w:rPr>
           <w:rFonts w:hint="eastAsia"/>
         </w:rPr>
-        <w:lastRenderedPageBreak/>
         <w:t xml:space="preserve">1.5.3 </w:t>
       </w:r>
       <w:r>
@@ -3318,12 +3454,14 @@
                 <w:rFonts w:ascii="Times New Roman" w:eastAsia="標楷體" w:hAnsi="Times New Roman" w:cs="Times New Roman"/>
               </w:rPr>
             </w:pPr>
+            <w:proofErr w:type="spellStart"/>
             <w:r>
               <w:rPr>
                 <w:rFonts w:ascii="Times New Roman" w:eastAsia="標楷體" w:hAnsi="Times New Roman" w:cs="Times New Roman" w:hint="eastAsia"/>
               </w:rPr>
               <w:t>Re:Book</w:t>
             </w:r>
+            <w:proofErr w:type="spellEnd"/>
           </w:p>
         </w:tc>
       </w:tr>
@@ -3818,7 +3956,14 @@
               <w:rPr>
                 <w:rFonts w:ascii="Times New Roman" w:eastAsia="標楷體" w:hAnsi="Times New Roman" w:cs="Times New Roman" w:hint="eastAsia"/>
               </w:rPr>
-              <w:t>：買家送出結帳瞬間，書籍剛好被他人下單，系統中斷流程並提示「書籍已被預訂」。</w:t>
+              <w:t>：買家送出結帳瞬間，書籍剛好被他人下單，</w:t>
+            </w:r>
+            <w:r>
+              <w:rPr>
+                <w:rFonts w:ascii="Times New Roman" w:eastAsia="標楷體" w:hAnsi="Times New Roman" w:cs="Times New Roman" w:hint="eastAsia"/>
+              </w:rPr>
+              <w:lastRenderedPageBreak/>
+              <w:t>系統中斷流程並提示「書籍已被預訂」。</w:t>
             </w:r>
           </w:p>
           <w:p>
@@ -3869,6 +4014,7 @@
               <w:rPr>
                 <w:rFonts w:ascii="Times New Roman" w:eastAsia="標楷體" w:hAnsi="Times New Roman" w:cs="Times New Roman" w:hint="eastAsia"/>
               </w:rPr>
+              <w:lastRenderedPageBreak/>
               <w:t>Special Requirements</w:t>
             </w:r>
           </w:p>
@@ -3887,14 +4033,7 @@
               <w:rPr>
                 <w:rFonts w:ascii="Times New Roman" w:eastAsia="標楷體" w:hAnsi="Times New Roman" w:cs="Times New Roman"/>
               </w:rPr>
-              <w:t>訂單生成與書籍狀態切換必須具備資</w:t>
-            </w:r>
-            <w:r>
-              <w:rPr>
-                <w:rFonts w:ascii="Times New Roman" w:eastAsia="標楷體" w:hAnsi="Times New Roman" w:cs="Times New Roman"/>
-              </w:rPr>
-              <w:lastRenderedPageBreak/>
-              <w:t>料庫的原子性（</w:t>
+              <w:t>訂單生成與書籍狀態切換必須具備資料庫的原子性（</w:t>
             </w:r>
             <w:r>
               <w:rPr>
@@ -3926,7 +4065,6 @@
               <w:rPr>
                 <w:rFonts w:ascii="Times New Roman" w:eastAsia="標楷體" w:hAnsi="Times New Roman" w:cs="Times New Roman" w:hint="eastAsia"/>
               </w:rPr>
-              <w:lastRenderedPageBreak/>
               <w:t>Technology and Data Variations List</w:t>
             </w:r>
           </w:p>
@@ -4158,12 +4296,14 @@
                 <w:rFonts w:ascii="Times New Roman" w:eastAsia="標楷體" w:hAnsi="Times New Roman" w:cs="Times New Roman"/>
               </w:rPr>
             </w:pPr>
+            <w:proofErr w:type="spellStart"/>
             <w:r>
               <w:rPr>
                 <w:rFonts w:ascii="Times New Roman" w:eastAsia="標楷體" w:hAnsi="Times New Roman" w:cs="Times New Roman" w:hint="eastAsia"/>
               </w:rPr>
               <w:t>Re:Book</w:t>
             </w:r>
+            <w:proofErr w:type="spellEnd"/>
           </w:p>
         </w:tc>
       </w:tr>
@@ -4660,7 +4800,14 @@
               <w:rPr>
                 <w:rFonts w:ascii="Times New Roman" w:eastAsia="標楷體" w:hAnsi="Times New Roman" w:cs="Times New Roman" w:hint="eastAsia"/>
               </w:rPr>
-              <w:t>網路中斷：訊息發送失敗，系統顯示錯誤提示並建議重新嘗試。</w:t>
+              <w:t>網路中斷：訊息發送失敗，系統</w:t>
+            </w:r>
+            <w:r>
+              <w:rPr>
+                <w:rFonts w:ascii="Times New Roman" w:eastAsia="標楷體" w:hAnsi="Times New Roman" w:cs="Times New Roman" w:hint="eastAsia"/>
+              </w:rPr>
+              <w:lastRenderedPageBreak/>
+              <w:t>顯示錯誤提示並建議重新嘗試。</w:t>
             </w:r>
           </w:p>
           <w:p>
@@ -4705,6 +4852,7 @@
               <w:rPr>
                 <w:rFonts w:ascii="Times New Roman" w:eastAsia="標楷體" w:hAnsi="Times New Roman" w:cs="Times New Roman" w:hint="eastAsia"/>
               </w:rPr>
+              <w:lastRenderedPageBreak/>
               <w:t>Special Requirements</w:t>
             </w:r>
           </w:p>
@@ -4793,7 +4941,6 @@
               <w:rPr>
                 <w:rFonts w:ascii="Times New Roman" w:eastAsia="標楷體" w:hAnsi="Times New Roman" w:cs="Times New Roman" w:hint="eastAsia"/>
               </w:rPr>
-              <w:lastRenderedPageBreak/>
               <w:t>Frequency of Occurrence</w:t>
             </w:r>
           </w:p>
@@ -4981,12 +5128,14 @@
                 <w:rFonts w:ascii="Times New Roman" w:eastAsia="標楷體" w:hAnsi="Times New Roman" w:cs="Times New Roman"/>
               </w:rPr>
             </w:pPr>
+            <w:proofErr w:type="spellStart"/>
             <w:r>
               <w:rPr>
                 <w:rFonts w:ascii="Times New Roman" w:eastAsia="標楷體" w:hAnsi="Times New Roman" w:cs="Times New Roman" w:hint="eastAsia"/>
               </w:rPr>
               <w:t>Re:Book</w:t>
             </w:r>
+            <w:proofErr w:type="spellEnd"/>
           </w:p>
         </w:tc>
       </w:tr>
@@ -5721,6 +5870,7 @@
               <w:rPr>
                 <w:rFonts w:ascii="Times New Roman" w:eastAsia="標楷體" w:hAnsi="Times New Roman" w:cs="Times New Roman"/>
               </w:rPr>
+              <w:lastRenderedPageBreak/>
               <w:t>賣家確認刪除。</w:t>
             </w:r>
           </w:p>
@@ -5802,14 +5952,7 @@
               <w:rPr>
                 <w:rFonts w:ascii="Times New Roman" w:eastAsia="標楷體" w:hAnsi="Times New Roman" w:cs="Times New Roman" w:hint="eastAsia"/>
               </w:rPr>
-              <w:t>批次移動失敗：若系統在處理大</w:t>
-            </w:r>
-            <w:r>
-              <w:rPr>
-                <w:rFonts w:ascii="Times New Roman" w:eastAsia="標楷體" w:hAnsi="Times New Roman" w:cs="Times New Roman" w:hint="eastAsia"/>
-              </w:rPr>
-              <w:lastRenderedPageBreak/>
-              <w:t>量</w:t>
+              <w:t>批次移動失敗：若系統在處理大量</w:t>
             </w:r>
             <w:r>
               <w:rPr>
@@ -6117,12 +6260,14 @@
                 <w:rFonts w:ascii="Times New Roman" w:eastAsia="標楷體" w:hAnsi="Times New Roman" w:cs="Times New Roman"/>
               </w:rPr>
             </w:pPr>
+            <w:proofErr w:type="spellStart"/>
             <w:r>
               <w:rPr>
                 <w:rFonts w:ascii="Times New Roman" w:eastAsia="標楷體" w:hAnsi="Times New Roman" w:cs="Times New Roman"/>
               </w:rPr>
               <w:t>Re:Book</w:t>
             </w:r>
+            <w:proofErr w:type="spellEnd"/>
           </w:p>
         </w:tc>
       </w:tr>
@@ -6703,6 +6848,7 @@
               <w:rPr>
                 <w:rFonts w:ascii="Times New Roman" w:eastAsia="標楷體" w:hAnsi="Times New Roman" w:cs="Times New Roman" w:hint="eastAsia"/>
               </w:rPr>
+              <w:lastRenderedPageBreak/>
               <w:t>該</w:t>
             </w:r>
             <w:r>
@@ -6808,6 +6954,7 @@
               <w:rPr>
                 <w:rFonts w:ascii="Times New Roman" w:eastAsia="標楷體" w:hAnsi="Times New Roman" w:cs="Times New Roman" w:hint="eastAsia"/>
               </w:rPr>
+              <w:lastRenderedPageBreak/>
               <w:t>Special Requirements</w:t>
             </w:r>
           </w:p>
@@ -7971,7 +8118,14 @@
               <w:rPr>
                 <w:rFonts w:ascii="Times New Roman" w:eastAsia="標楷體" w:hAnsi="Times New Roman" w:cs="Times New Roman" w:hint="eastAsia"/>
               </w:rPr>
-              <w:t>。讓買家在後續可以進行比價或發起私訊以進行協商。</w:t>
+              <w:t>。讓買家在後續可以進行比價或</w:t>
+            </w:r>
+            <w:r>
+              <w:rPr>
+                <w:rFonts w:ascii="Times New Roman" w:eastAsia="標楷體" w:hAnsi="Times New Roman" w:cs="Times New Roman" w:hint="eastAsia"/>
+              </w:rPr>
+              <w:lastRenderedPageBreak/>
+              <w:t>發起私訊以進行協商。</w:t>
             </w:r>
           </w:p>
         </w:tc>
@@ -7991,7 +8145,14 @@
               <w:rPr>
                 <w:rFonts w:ascii="Times New Roman" w:eastAsia="標楷體" w:hAnsi="Times New Roman" w:cs="Times New Roman" w:hint="eastAsia"/>
               </w:rPr>
-              <w:t>交易狀態</w:t>
+              <w:lastRenderedPageBreak/>
+              <w:t>書籍</w:t>
+            </w:r>
+            <w:r>
+              <w:rPr>
+                <w:rFonts w:ascii="Times New Roman" w:eastAsia="標楷體" w:hAnsi="Times New Roman" w:cs="Times New Roman" w:hint="eastAsia"/>
+              </w:rPr>
+              <w:t>狀態</w:t>
             </w:r>
           </w:p>
         </w:tc>
@@ -8078,7 +8239,6 @@
         <w:rPr>
           <w:rFonts w:hint="eastAsia"/>
         </w:rPr>
-        <w:lastRenderedPageBreak/>
         <w:t xml:space="preserve">1.8 </w:t>
       </w:r>
       <w:r>
@@ -8977,6 +9137,7 @@
         <w:rPr>
           <w:rFonts w:ascii="Times New Roman" w:eastAsia="標楷體" w:hAnsi="Times New Roman" w:cs="Times New Roman" w:hint="eastAsia"/>
         </w:rPr>
+        <w:lastRenderedPageBreak/>
         <w:t>2.</w:t>
       </w:r>
       <w:r>
@@ -9025,7 +9186,7 @@
         <w:rPr>
           <w:rFonts w:ascii="Times New Roman" w:eastAsia="標楷體" w:hAnsi="Times New Roman" w:cs="Times New Roman" w:hint="eastAsia"/>
         </w:rPr>
-        <w:t>書籍狀態、書況：應作為</w:t>
+        <w:t>書況：應作為</w:t>
       </w:r>
       <w:r>
         <w:rPr>
@@ -9067,31 +9228,37 @@
         <w:rPr>
           <w:rFonts w:ascii="Times New Roman" w:eastAsia="標楷體" w:hAnsi="Times New Roman" w:cs="Times New Roman" w:hint="eastAsia"/>
         </w:rPr>
-        <w:t>訂單狀態、交易狀態：應作為</w:t>
+        <w:t xml:space="preserve">ISBN </w:t>
       </w:r>
       <w:r>
         <w:rPr>
           <w:rFonts w:ascii="Times New Roman" w:eastAsia="標楷體" w:hAnsi="Times New Roman" w:cs="Times New Roman" w:hint="eastAsia"/>
         </w:rPr>
-        <w:t xml:space="preserve"> Order </w:t>
+        <w:t>格式、書名</w:t>
       </w:r>
       <w:r>
         <w:rPr>
           <w:rFonts w:ascii="Times New Roman" w:eastAsia="標楷體" w:hAnsi="Times New Roman" w:cs="Times New Roman" w:hint="eastAsia"/>
         </w:rPr>
-        <w:t>類別的屬性</w:t>
+        <w:t>、</w:t>
       </w:r>
       <w:r>
         <w:rPr>
           <w:rFonts w:ascii="Times New Roman" w:eastAsia="標楷體" w:hAnsi="Times New Roman" w:cs="Times New Roman" w:hint="eastAsia"/>
         </w:rPr>
-        <w:t xml:space="preserve"> (Enum)</w:t>
+        <w:t>作者：應直接作為</w:t>
       </w:r>
       <w:r>
         <w:rPr>
           <w:rFonts w:ascii="Times New Roman" w:eastAsia="標楷體" w:hAnsi="Times New Roman" w:cs="Times New Roman" w:hint="eastAsia"/>
         </w:rPr>
-        <w:t>。</w:t>
+        <w:t xml:space="preserve"> Book </w:t>
+      </w:r>
+      <w:r>
+        <w:rPr>
+          <w:rFonts w:ascii="Times New Roman" w:eastAsia="標楷體" w:hAnsi="Times New Roman" w:cs="Times New Roman" w:hint="eastAsia"/>
+        </w:rPr>
+        <w:t>類別的字串屬性。</w:t>
       </w:r>
     </w:p>
     <w:p>
@@ -9109,50 +9276,19 @@
         <w:rPr>
           <w:rFonts w:ascii="Times New Roman" w:eastAsia="標楷體" w:hAnsi="Times New Roman" w:cs="Times New Roman" w:hint="eastAsia"/>
         </w:rPr>
-        <w:lastRenderedPageBreak/>
-        <w:t xml:space="preserve">ISBN </w:t>
+        <w:t>所在地：應作為</w:t>
       </w:r>
       <w:r>
         <w:rPr>
           <w:rFonts w:ascii="Times New Roman" w:eastAsia="標楷體" w:hAnsi="Times New Roman" w:cs="Times New Roman" w:hint="eastAsia"/>
         </w:rPr>
-        <w:t>格式、書名</w:t>
+        <w:t>買家與賣家</w:t>
       </w:r>
       <w:r>
         <w:rPr>
           <w:rFonts w:ascii="Times New Roman" w:eastAsia="標楷體" w:hAnsi="Times New Roman" w:cs="Times New Roman" w:hint="eastAsia"/>
         </w:rPr>
-        <w:t>、</w:t>
-      </w:r>
-      <w:r>
-        <w:rPr>
-          <w:rFonts w:ascii="Times New Roman" w:eastAsia="標楷體" w:hAnsi="Times New Roman" w:cs="Times New Roman" w:hint="eastAsia"/>
-        </w:rPr>
-        <w:t>作者：應直接作為</w:t>
-      </w:r>
-      <w:r>
-        <w:rPr>
-          <w:rFonts w:ascii="Times New Roman" w:eastAsia="標楷體" w:hAnsi="Times New Roman" w:cs="Times New Roman" w:hint="eastAsia"/>
-        </w:rPr>
-        <w:t xml:space="preserve"> Book </w:t>
-      </w:r>
-      <w:r>
-        <w:rPr>
-          <w:rFonts w:ascii="Times New Roman" w:eastAsia="標楷體" w:hAnsi="Times New Roman" w:cs="Times New Roman" w:hint="eastAsia"/>
-        </w:rPr>
-        <w:t>類別的字串屬性</w:t>
-      </w:r>
-      <w:r>
-        <w:rPr>
-          <w:rFonts w:ascii="Times New Roman" w:eastAsia="標楷體" w:hAnsi="Times New Roman" w:cs="Times New Roman" w:hint="eastAsia"/>
-        </w:rPr>
-        <w:t xml:space="preserve"> (String)</w:t>
-      </w:r>
-      <w:r>
-        <w:rPr>
-          <w:rFonts w:ascii="Times New Roman" w:eastAsia="標楷體" w:hAnsi="Times New Roman" w:cs="Times New Roman" w:hint="eastAsia"/>
-        </w:rPr>
-        <w:t>。</w:t>
+        <w:t>的屬性。</w:t>
       </w:r>
     </w:p>
     <w:p>
@@ -9170,19 +9306,19 @@
         <w:rPr>
           <w:rFonts w:ascii="Times New Roman" w:eastAsia="標楷體" w:hAnsi="Times New Roman" w:cs="Times New Roman" w:hint="eastAsia"/>
         </w:rPr>
-        <w:t>所在地：應作為</w:t>
+        <w:t>類別名稱：應作為</w:t>
       </w:r>
       <w:r>
         <w:rPr>
           <w:rFonts w:ascii="Times New Roman" w:eastAsia="標楷體" w:hAnsi="Times New Roman" w:cs="Times New Roman" w:hint="eastAsia"/>
         </w:rPr>
-        <w:t>買家與賣家</w:t>
+        <w:t xml:space="preserve"> Category </w:t>
       </w:r>
       <w:r>
         <w:rPr>
           <w:rFonts w:ascii="Times New Roman" w:eastAsia="標楷體" w:hAnsi="Times New Roman" w:cs="Times New Roman" w:hint="eastAsia"/>
         </w:rPr>
-        <w:t>的屬性。</w:t>
+        <w:t>類別的屬性。</w:t>
       </w:r>
     </w:p>
     <w:p>
@@ -9200,19 +9336,19 @@
         <w:rPr>
           <w:rFonts w:ascii="Times New Roman" w:eastAsia="標楷體" w:hAnsi="Times New Roman" w:cs="Times New Roman" w:hint="eastAsia"/>
         </w:rPr>
-        <w:t>類別名稱：應作為</w:t>
+        <w:t>訂單資訊：這只是一堆</w:t>
       </w:r>
       <w:r>
         <w:rPr>
           <w:rFonts w:ascii="Times New Roman" w:eastAsia="標楷體" w:hAnsi="Times New Roman" w:cs="Times New Roman" w:hint="eastAsia"/>
         </w:rPr>
-        <w:t xml:space="preserve"> Category </w:t>
+        <w:t xml:space="preserve"> Order </w:t>
       </w:r>
       <w:r>
         <w:rPr>
           <w:rFonts w:ascii="Times New Roman" w:eastAsia="標楷體" w:hAnsi="Times New Roman" w:cs="Times New Roman" w:hint="eastAsia"/>
         </w:rPr>
-        <w:t>類別的屬性。</w:t>
+        <w:t>屬性的集合代稱。</w:t>
       </w:r>
     </w:p>
     <w:p>
@@ -9230,36 +9366,6 @@
         <w:rPr>
           <w:rFonts w:ascii="Times New Roman" w:eastAsia="標楷體" w:hAnsi="Times New Roman" w:cs="Times New Roman" w:hint="eastAsia"/>
         </w:rPr>
-        <w:t>訂單資訊：這只是一堆</w:t>
-      </w:r>
-      <w:r>
-        <w:rPr>
-          <w:rFonts w:ascii="Times New Roman" w:eastAsia="標楷體" w:hAnsi="Times New Roman" w:cs="Times New Roman" w:hint="eastAsia"/>
-        </w:rPr>
-        <w:t xml:space="preserve"> Order </w:t>
-      </w:r>
-      <w:r>
-        <w:rPr>
-          <w:rFonts w:ascii="Times New Roman" w:eastAsia="標楷體" w:hAnsi="Times New Roman" w:cs="Times New Roman" w:hint="eastAsia"/>
-        </w:rPr>
-        <w:t>屬性的集合代稱。</w:t>
-      </w:r>
-    </w:p>
-    <w:p>
-      <w:pPr>
-        <w:pStyle w:val="a9"/>
-        <w:numPr>
-          <w:ilvl w:val="0"/>
-          <w:numId w:val="13"/>
-        </w:numPr>
-        <w:rPr>
-          <w:rFonts w:ascii="Times New Roman" w:eastAsia="標楷體" w:hAnsi="Times New Roman" w:cs="Times New Roman"/>
-        </w:rPr>
-      </w:pPr>
-      <w:r>
-        <w:rPr>
-          <w:rFonts w:ascii="Times New Roman" w:eastAsia="標楷體" w:hAnsi="Times New Roman" w:cs="Times New Roman" w:hint="eastAsia"/>
-        </w:rPr>
         <w:t>書籍清單：在程式碼中通常是資料結構（如</w:t>
       </w:r>
       <w:r>
@@ -9448,7 +9554,13 @@
         <w:rPr>
           <w:rFonts w:ascii="Times New Roman" w:eastAsia="標楷體" w:hAnsi="Times New Roman" w:cs="Times New Roman" w:hint="eastAsia"/>
         </w:rPr>
-        <w:t>classes</w:t>
+        <w:t>C</w:t>
+      </w:r>
+      <w:r>
+        <w:rPr>
+          <w:rFonts w:ascii="Times New Roman" w:eastAsia="標楷體" w:hAnsi="Times New Roman" w:cs="Times New Roman" w:hint="eastAsia"/>
+        </w:rPr>
+        <w:t>lasses</w:t>
       </w:r>
       <w:r>
         <w:rPr>
@@ -9619,6 +9731,46 @@
           </w:p>
         </w:tc>
       </w:tr>
+      <w:tr>
+        <w:tc>
+          <w:tcPr>
+            <w:tcW w:w="4148" w:type="dxa"/>
+          </w:tcPr>
+          <w:p>
+            <w:pPr>
+              <w:rPr>
+                <w:rFonts w:ascii="Times New Roman" w:eastAsia="標楷體" w:hAnsi="Times New Roman" w:cs="Times New Roman" w:hint="eastAsia"/>
+              </w:rPr>
+            </w:pPr>
+            <w:r>
+              <w:rPr>
+                <w:rFonts w:ascii="Times New Roman" w:eastAsia="標楷體" w:hAnsi="Times New Roman" w:cs="Times New Roman" w:hint="eastAsia"/>
+                <w:color w:val="FF0000"/>
+              </w:rPr>
+              <w:t>書籍狀態</w:t>
+            </w:r>
+          </w:p>
+        </w:tc>
+        <w:tc>
+          <w:tcPr>
+            <w:tcW w:w="4148" w:type="dxa"/>
+          </w:tcPr>
+          <w:p>
+            <w:pPr>
+              <w:rPr>
+                <w:rFonts w:ascii="Times New Roman" w:eastAsia="標楷體" w:hAnsi="Times New Roman" w:cs="Times New Roman" w:hint="eastAsia"/>
+              </w:rPr>
+            </w:pPr>
+            <w:r>
+              <w:rPr>
+                <w:rFonts w:ascii="Times New Roman" w:eastAsia="標楷體" w:hAnsi="Times New Roman" w:cs="Times New Roman" w:hint="eastAsia"/>
+                <w:color w:val="FF0000"/>
+              </w:rPr>
+              <w:t>訂單狀態</w:t>
+            </w:r>
+          </w:p>
+        </w:tc>
+      </w:tr>
     </w:tbl>
     <w:p>
       <w:pPr>
@@ -9629,6 +9781,7 @@
     </w:p>
     <w:p>
       <w:pPr>
+        <w:jc w:val="both"/>
         <w:rPr>
           <w:rFonts w:ascii="Times New Roman" w:eastAsia="標楷體" w:hAnsi="Times New Roman" w:cs="Times New Roman"/>
         </w:rPr>
@@ -9643,12 +9796,18 @@
         <w:rPr>
           <w:rFonts w:ascii="Times New Roman" w:eastAsia="標楷體" w:hAnsi="Times New Roman" w:cs="Times New Roman" w:hint="eastAsia"/>
         </w:rPr>
-        <w:t>class</w:t>
+        <w:t>C</w:t>
       </w:r>
       <w:r>
         <w:rPr>
           <w:rFonts w:ascii="Times New Roman" w:eastAsia="標楷體" w:hAnsi="Times New Roman" w:cs="Times New Roman" w:hint="eastAsia"/>
         </w:rPr>
+        <w:t>lass</w:t>
+      </w:r>
+      <w:r>
+        <w:rPr>
+          <w:rFonts w:ascii="Times New Roman" w:eastAsia="標楷體" w:hAnsi="Times New Roman" w:cs="Times New Roman" w:hint="eastAsia"/>
+        </w:rPr>
         <w:t>—</w:t>
       </w:r>
       <w:r>
@@ -9685,12 +9844,18 @@
         <w:rPr>
           <w:rFonts w:ascii="Times New Roman" w:eastAsia="標楷體" w:hAnsi="Times New Roman" w:cs="Times New Roman" w:hint="eastAsia"/>
         </w:rPr>
-        <w:t>class</w:t>
+        <w:t>C</w:t>
       </w:r>
       <w:r>
         <w:rPr>
           <w:rFonts w:ascii="Times New Roman" w:eastAsia="標楷體" w:hAnsi="Times New Roman" w:cs="Times New Roman" w:hint="eastAsia"/>
         </w:rPr>
+        <w:t>lass</w:t>
+      </w:r>
+      <w:r>
+        <w:rPr>
+          <w:rFonts w:ascii="Times New Roman" w:eastAsia="標楷體" w:hAnsi="Times New Roman" w:cs="Times New Roman" w:hint="eastAsia"/>
+        </w:rPr>
         <w:t>名稱從</w:t>
       </w:r>
       <w:r>
@@ -9715,11 +9880,181 @@
         <w:rPr>
           <w:rFonts w:ascii="Times New Roman" w:eastAsia="標楷體" w:hAnsi="Times New Roman" w:cs="Times New Roman" w:hint="eastAsia"/>
         </w:rPr>
-        <w:t>簡化為「賣場」。至此</w:t>
-      </w:r>
+        <w:t>簡化為「賣場」。</w:t>
+      </w:r>
+    </w:p>
+    <w:p>
+      <w:pPr>
+        <w:jc w:val="both"/>
+        <w:rPr>
+          <w:rFonts w:ascii="Times New Roman" w:eastAsia="標楷體" w:hAnsi="Times New Roman" w:cs="Times New Roman"/>
+          <w:color w:val="FF0000"/>
+        </w:rPr>
+      </w:pPr>
       <w:r>
         <w:rPr>
           <w:rFonts w:ascii="Times New Roman" w:eastAsia="標楷體" w:hAnsi="Times New Roman" w:cs="Times New Roman" w:hint="eastAsia"/>
+          <w:color w:val="FF0000"/>
+        </w:rPr>
+        <w:t>為了</w:t>
+      </w:r>
+      <w:r>
+        <w:rPr>
+          <w:rFonts w:ascii="Times New Roman" w:eastAsia="標楷體" w:hAnsi="Times New Roman" w:cs="Times New Roman" w:hint="eastAsia"/>
+          <w:color w:val="FF0000"/>
+        </w:rPr>
+        <w:t>允許一個帳號同時買賣東西</w:t>
+      </w:r>
+      <w:r>
+        <w:rPr>
+          <w:rFonts w:ascii="Times New Roman" w:eastAsia="標楷體" w:hAnsi="Times New Roman" w:cs="Times New Roman" w:hint="eastAsia"/>
+          <w:color w:val="FF0000"/>
+        </w:rPr>
+        <w:t>，我們</w:t>
+      </w:r>
+      <w:r>
+        <w:rPr>
+          <w:rFonts w:ascii="Times New Roman" w:eastAsia="標楷體" w:hAnsi="Times New Roman" w:cs="Times New Roman" w:hint="eastAsia"/>
+          <w:color w:val="FF0000"/>
+        </w:rPr>
+        <w:t>將</w:t>
+      </w:r>
+      <w:r>
+        <w:rPr>
+          <w:rFonts w:ascii="Times New Roman" w:eastAsia="標楷體" w:hAnsi="Times New Roman" w:cs="Times New Roman" w:hint="eastAsia"/>
+          <w:color w:val="FF0000"/>
+        </w:rPr>
+        <w:t>「</w:t>
+      </w:r>
+      <w:r>
+        <w:rPr>
+          <w:rFonts w:ascii="Times New Roman" w:eastAsia="標楷體" w:hAnsi="Times New Roman" w:cs="Times New Roman" w:hint="eastAsia"/>
+          <w:color w:val="FF0000"/>
+        </w:rPr>
+        <w:t>買家</w:t>
+      </w:r>
+      <w:r>
+        <w:rPr>
+          <w:rFonts w:ascii="Times New Roman" w:eastAsia="標楷體" w:hAnsi="Times New Roman" w:cs="Times New Roman" w:hint="eastAsia"/>
+          <w:color w:val="FF0000"/>
+        </w:rPr>
+        <w:t>」</w:t>
+      </w:r>
+      <w:r>
+        <w:rPr>
+          <w:rFonts w:ascii="Times New Roman" w:eastAsia="標楷體" w:hAnsi="Times New Roman" w:cs="Times New Roman" w:hint="eastAsia"/>
+          <w:color w:val="FF0000"/>
+        </w:rPr>
+        <w:t>和</w:t>
+      </w:r>
+      <w:r>
+        <w:rPr>
+          <w:rFonts w:ascii="Times New Roman" w:eastAsia="標楷體" w:hAnsi="Times New Roman" w:cs="Times New Roman" w:hint="eastAsia"/>
+          <w:color w:val="FF0000"/>
+        </w:rPr>
+        <w:t>「</w:t>
+      </w:r>
+      <w:r>
+        <w:rPr>
+          <w:rFonts w:ascii="Times New Roman" w:eastAsia="標楷體" w:hAnsi="Times New Roman" w:cs="Times New Roman" w:hint="eastAsia"/>
+          <w:color w:val="FF0000"/>
+        </w:rPr>
+        <w:t>賣家</w:t>
+      </w:r>
+      <w:r>
+        <w:rPr>
+          <w:rFonts w:ascii="Times New Roman" w:eastAsia="標楷體" w:hAnsi="Times New Roman" w:cs="Times New Roman" w:hint="eastAsia"/>
+          <w:color w:val="FF0000"/>
+        </w:rPr>
+        <w:t>」</w:t>
+      </w:r>
+      <w:r>
+        <w:rPr>
+          <w:rFonts w:ascii="Times New Roman" w:eastAsia="標楷體" w:hAnsi="Times New Roman" w:cs="Times New Roman" w:hint="eastAsia"/>
+          <w:color w:val="FF0000"/>
+        </w:rPr>
+        <w:t>合併成一個帶有多重角色的</w:t>
+      </w:r>
+      <w:r>
+        <w:rPr>
+          <w:rFonts w:ascii="Times New Roman" w:eastAsia="標楷體" w:hAnsi="Times New Roman" w:cs="Times New Roman" w:hint="eastAsia"/>
+          <w:color w:val="FF0000"/>
+        </w:rPr>
+        <w:t>Class</w:t>
+      </w:r>
+      <w:r>
+        <w:rPr>
+          <w:rFonts w:ascii="Times New Roman" w:eastAsia="標楷體" w:hAnsi="Times New Roman" w:cs="Times New Roman" w:hint="eastAsia"/>
+          <w:color w:val="FF0000"/>
+        </w:rPr>
+        <w:t>，名為「使用者」</w:t>
+      </w:r>
+      <w:r>
+        <w:rPr>
+          <w:rFonts w:ascii="Times New Roman" w:eastAsia="標楷體" w:hAnsi="Times New Roman" w:cs="Times New Roman" w:hint="eastAsia"/>
+          <w:color w:val="FF0000"/>
+        </w:rPr>
+        <w:t>，並新增一個叫做「角色」的</w:t>
+      </w:r>
+      <w:r>
+        <w:rPr>
+          <w:rFonts w:ascii="Times New Roman" w:eastAsia="標楷體" w:hAnsi="Times New Roman" w:cs="Times New Roman" w:hint="eastAsia"/>
+          <w:color w:val="FF0000"/>
+        </w:rPr>
+        <w:t>Class</w:t>
+      </w:r>
+      <w:r>
+        <w:rPr>
+          <w:rFonts w:ascii="Times New Roman" w:eastAsia="標楷體" w:hAnsi="Times New Roman" w:cs="Times New Roman" w:hint="eastAsia"/>
+          <w:color w:val="FF0000"/>
+        </w:rPr>
+        <w:t>，記錄使用者是否有</w:t>
+      </w:r>
+      <w:r>
+        <w:rPr>
+          <w:rFonts w:ascii="Times New Roman" w:eastAsia="標楷體" w:hAnsi="Times New Roman" w:cs="Times New Roman" w:hint="eastAsia"/>
+          <w:color w:val="FF0000"/>
+        </w:rPr>
+        <w:t>「買家」</w:t>
+      </w:r>
+      <w:r>
+        <w:rPr>
+          <w:rFonts w:ascii="Times New Roman" w:eastAsia="標楷體" w:hAnsi="Times New Roman" w:cs="Times New Roman" w:hint="eastAsia"/>
+          <w:color w:val="FF0000"/>
+        </w:rPr>
+        <w:t>或</w:t>
+      </w:r>
+      <w:r>
+        <w:rPr>
+          <w:rFonts w:ascii="Times New Roman" w:eastAsia="標楷體" w:hAnsi="Times New Roman" w:cs="Times New Roman" w:hint="eastAsia"/>
+          <w:color w:val="FF0000"/>
+        </w:rPr>
+        <w:t>「賣家」</w:t>
+      </w:r>
+      <w:r>
+        <w:rPr>
+          <w:rFonts w:ascii="Times New Roman" w:eastAsia="標楷體" w:hAnsi="Times New Roman" w:cs="Times New Roman" w:hint="eastAsia"/>
+          <w:color w:val="FF0000"/>
+        </w:rPr>
+        <w:t>的身份。</w:t>
+      </w:r>
+    </w:p>
+    <w:p>
+      <w:pPr>
+        <w:jc w:val="both"/>
+        <w:rPr>
+          <w:rFonts w:ascii="Times New Roman" w:eastAsia="標楷體" w:hAnsi="Times New Roman" w:cs="Times New Roman"/>
+        </w:rPr>
+      </w:pPr>
+      <w:r>
+        <w:rPr>
+          <w:rFonts w:ascii="Times New Roman" w:eastAsia="標楷體" w:hAnsi="Times New Roman" w:cs="Times New Roman" w:hint="eastAsia"/>
+        </w:rPr>
+        <w:t>至此</w:t>
+      </w:r>
+      <w:r>
+        <w:rPr>
+          <w:rFonts w:ascii="Times New Roman" w:eastAsia="標楷體" w:hAnsi="Times New Roman" w:cs="Times New Roman" w:hint="eastAsia"/>
         </w:rPr>
         <w:t>，本專案共有</w:t>
       </w:r>
@@ -9732,8 +10067,9 @@
       <w:r>
         <w:rPr>
           <w:rFonts w:ascii="Times New Roman" w:eastAsia="標楷體" w:hAnsi="Times New Roman" w:cs="Times New Roman" w:hint="eastAsia"/>
-        </w:rPr>
-        <w:t>9</w:t>
+          <w:color w:val="FF0000"/>
+        </w:rPr>
+        <w:t>11</w:t>
       </w:r>
       <w:r>
         <w:rPr>
@@ -9745,7 +10081,13 @@
         <w:rPr>
           <w:rFonts w:ascii="Times New Roman" w:eastAsia="標楷體" w:hAnsi="Times New Roman" w:cs="Times New Roman" w:hint="eastAsia"/>
         </w:rPr>
-        <w:t>classes</w:t>
+        <w:t>C</w:t>
+      </w:r>
+      <w:r>
+        <w:rPr>
+          <w:rFonts w:ascii="Times New Roman" w:eastAsia="標楷體" w:hAnsi="Times New Roman" w:cs="Times New Roman" w:hint="eastAsia"/>
+        </w:rPr>
+        <w:t>lasses</w:t>
       </w:r>
       <w:r>
         <w:rPr>
@@ -9773,20 +10115,24 @@
           <w:p>
             <w:pPr>
               <w:rPr>
-                <w:rFonts w:ascii="Times New Roman" w:eastAsia="標楷體" w:hAnsi="Times New Roman" w:cs="Times New Roman"/>
-              </w:rPr>
-            </w:pPr>
-            <w:r>
-              <w:rPr>
-                <w:rFonts w:ascii="Times New Roman" w:eastAsia="標楷體" w:hAnsi="Times New Roman" w:cs="Times New Roman" w:hint="eastAsia"/>
-              </w:rPr>
-              <w:t>買家</w:t>
-            </w:r>
-            <w:r>
-              <w:rPr>
-                <w:rFonts w:ascii="Times New Roman" w:eastAsia="標楷體" w:hAnsi="Times New Roman" w:cs="Times New Roman" w:hint="eastAsia"/>
-              </w:rPr>
-              <w:t xml:space="preserve"> (Buyer)</w:t>
+                <w:rFonts w:ascii="Times New Roman" w:eastAsia="標楷體" w:hAnsi="Times New Roman" w:cs="Times New Roman" w:hint="eastAsia"/>
+                <w:color w:val="FF0000"/>
+              </w:rPr>
+            </w:pPr>
+            <w:r>
+              <w:rPr>
+                <w:rFonts w:ascii="Times New Roman" w:eastAsia="標楷體" w:hAnsi="Times New Roman" w:cs="Times New Roman" w:hint="eastAsia"/>
+                <w:color w:val="FF0000"/>
+              </w:rPr>
+              <w:lastRenderedPageBreak/>
+              <w:t>使用者</w:t>
+            </w:r>
+            <w:r>
+              <w:rPr>
+                <w:rFonts w:ascii="Times New Roman" w:eastAsia="標楷體" w:hAnsi="Times New Roman" w:cs="Times New Roman" w:hint="eastAsia"/>
+                <w:color w:val="FF0000"/>
+              </w:rPr>
+              <w:t xml:space="preserve"> (User)</w:t>
             </w:r>
           </w:p>
         </w:tc>
@@ -9797,20 +10143,23 @@
           <w:p>
             <w:pPr>
               <w:rPr>
-                <w:rFonts w:ascii="Times New Roman" w:eastAsia="標楷體" w:hAnsi="Times New Roman" w:cs="Times New Roman"/>
-              </w:rPr>
-            </w:pPr>
-            <w:r>
-              <w:rPr>
-                <w:rFonts w:ascii="Times New Roman" w:eastAsia="標楷體" w:hAnsi="Times New Roman" w:cs="Times New Roman" w:hint="eastAsia"/>
-              </w:rPr>
-              <w:t>賣家</w:t>
-            </w:r>
-            <w:r>
-              <w:rPr>
-                <w:rFonts w:ascii="Times New Roman" w:eastAsia="標楷體" w:hAnsi="Times New Roman" w:cs="Times New Roman" w:hint="eastAsia"/>
-              </w:rPr>
-              <w:t xml:space="preserve"> (Seller)</w:t>
+                <w:rFonts w:ascii="Times New Roman" w:eastAsia="標楷體" w:hAnsi="Times New Roman" w:cs="Times New Roman" w:hint="eastAsia"/>
+                <w:color w:val="FF0000"/>
+              </w:rPr>
+            </w:pPr>
+            <w:r>
+              <w:rPr>
+                <w:rFonts w:ascii="Times New Roman" w:eastAsia="標楷體" w:hAnsi="Times New Roman" w:cs="Times New Roman" w:hint="eastAsia"/>
+                <w:color w:val="FF0000"/>
+              </w:rPr>
+              <w:t>角色</w:t>
+            </w:r>
+            <w:r>
+              <w:rPr>
+                <w:rFonts w:ascii="Times New Roman" w:eastAsia="標楷體" w:hAnsi="Times New Roman" w:cs="Times New Roman" w:hint="eastAsia"/>
+                <w:color w:val="FF0000"/>
+              </w:rPr>
+              <w:t xml:space="preserve"> (Role)</w:t>
             </w:r>
           </w:p>
         </w:tc>
@@ -9860,7 +10209,21 @@
               <w:rPr>
                 <w:rFonts w:ascii="Times New Roman" w:eastAsia="標楷體" w:hAnsi="Times New Roman" w:cs="Times New Roman" w:hint="eastAsia"/>
               </w:rPr>
-              <w:t xml:space="preserve"> (BookInfo)</w:t>
+              <w:t xml:space="preserve"> (</w:t>
+            </w:r>
+            <w:proofErr w:type="spellStart"/>
+            <w:r>
+              <w:rPr>
+                <w:rFonts w:ascii="Times New Roman" w:eastAsia="標楷體" w:hAnsi="Times New Roman" w:cs="Times New Roman" w:hint="eastAsia"/>
+              </w:rPr>
+              <w:t>BookInfo</w:t>
+            </w:r>
+            <w:proofErr w:type="spellEnd"/>
+            <w:r>
+              <w:rPr>
+                <w:rFonts w:ascii="Times New Roman" w:eastAsia="標楷體" w:hAnsi="Times New Roman" w:cs="Times New Roman" w:hint="eastAsia"/>
+              </w:rPr>
+              <w:t>)</w:t>
             </w:r>
           </w:p>
         </w:tc>
@@ -9984,6 +10347,104 @@
               </w:rPr>
               <w:t xml:space="preserve"> (Shop)</w:t>
             </w:r>
+          </w:p>
+        </w:tc>
+      </w:tr>
+      <w:tr>
+        <w:tc>
+          <w:tcPr>
+            <w:tcW w:w="2765" w:type="dxa"/>
+          </w:tcPr>
+          <w:p>
+            <w:pPr>
+              <w:rPr>
+                <w:rFonts w:ascii="Times New Roman" w:eastAsia="標楷體" w:hAnsi="Times New Roman" w:cs="Times New Roman" w:hint="eastAsia"/>
+              </w:rPr>
+            </w:pPr>
+            <w:r>
+              <w:rPr>
+                <w:rFonts w:ascii="Times New Roman" w:eastAsia="標楷體" w:hAnsi="Times New Roman" w:cs="Times New Roman" w:hint="eastAsia"/>
+                <w:color w:val="FF0000"/>
+              </w:rPr>
+              <w:t>書籍狀態</w:t>
+            </w:r>
+            <w:r>
+              <w:rPr>
+                <w:rFonts w:ascii="Times New Roman" w:eastAsia="標楷體" w:hAnsi="Times New Roman" w:cs="Times New Roman" w:hint="eastAsia"/>
+                <w:color w:val="FF0000"/>
+              </w:rPr>
+              <w:t xml:space="preserve"> (</w:t>
+            </w:r>
+            <w:proofErr w:type="spellStart"/>
+            <w:r>
+              <w:rPr>
+                <w:rFonts w:ascii="Times New Roman" w:eastAsia="標楷體" w:hAnsi="Times New Roman" w:cs="Times New Roman" w:hint="eastAsia"/>
+                <w:color w:val="FF0000"/>
+              </w:rPr>
+              <w:t>BookStatus</w:t>
+            </w:r>
+            <w:proofErr w:type="spellEnd"/>
+            <w:r>
+              <w:rPr>
+                <w:rFonts w:ascii="Times New Roman" w:eastAsia="標楷體" w:hAnsi="Times New Roman" w:cs="Times New Roman" w:hint="eastAsia"/>
+                <w:color w:val="FF0000"/>
+              </w:rPr>
+              <w:t>)</w:t>
+            </w:r>
+          </w:p>
+        </w:tc>
+        <w:tc>
+          <w:tcPr>
+            <w:tcW w:w="2765" w:type="dxa"/>
+          </w:tcPr>
+          <w:p>
+            <w:pPr>
+              <w:rPr>
+                <w:rFonts w:ascii="Times New Roman" w:eastAsia="標楷體" w:hAnsi="Times New Roman" w:cs="Times New Roman" w:hint="eastAsia"/>
+              </w:rPr>
+            </w:pPr>
+            <w:r>
+              <w:rPr>
+                <w:rFonts w:ascii="Times New Roman" w:eastAsia="標楷體" w:hAnsi="Times New Roman" w:cs="Times New Roman" w:hint="eastAsia"/>
+                <w:color w:val="FF0000"/>
+              </w:rPr>
+              <w:t>訂單狀態</w:t>
+            </w:r>
+            <w:r>
+              <w:rPr>
+                <w:rFonts w:ascii="Times New Roman" w:eastAsia="標楷體" w:hAnsi="Times New Roman" w:cs="Times New Roman" w:hint="eastAsia"/>
+                <w:color w:val="FF0000"/>
+              </w:rPr>
+              <w:t xml:space="preserve"> (</w:t>
+            </w:r>
+            <w:proofErr w:type="spellStart"/>
+            <w:r>
+              <w:rPr>
+                <w:rFonts w:ascii="Times New Roman" w:eastAsia="標楷體" w:hAnsi="Times New Roman" w:cs="Times New Roman" w:hint="eastAsia"/>
+                <w:color w:val="FF0000"/>
+              </w:rPr>
+              <w:t>OrderStatus</w:t>
+            </w:r>
+            <w:proofErr w:type="spellEnd"/>
+            <w:r>
+              <w:rPr>
+                <w:rFonts w:ascii="Times New Roman" w:eastAsia="標楷體" w:hAnsi="Times New Roman" w:cs="Times New Roman" w:hint="eastAsia"/>
+                <w:color w:val="FF0000"/>
+              </w:rPr>
+              <w:t>)</w:t>
+            </w:r>
+          </w:p>
+        </w:tc>
+        <w:tc>
+          <w:tcPr>
+            <w:tcW w:w="2766" w:type="dxa"/>
+          </w:tcPr>
+          <w:p>
+            <w:pPr>
+              <w:rPr>
+                <w:rFonts w:ascii="Times New Roman" w:eastAsia="標楷體" w:hAnsi="Times New Roman" w:cs="Times New Roman" w:hint="eastAsia"/>
+              </w:rPr>
+            </w:pPr>
           </w:p>
         </w:tc>
       </w:tr>
@@ -9997,6 +10458,76 @@
     </w:p>
     <w:p>
       <w:pPr>
+        <w:rPr>
+          <w:rFonts w:ascii="Times New Roman" w:eastAsia="標楷體" w:hAnsi="Times New Roman" w:cs="Times New Roman"/>
+        </w:rPr>
+      </w:pPr>
+    </w:p>
+    <w:p>
+      <w:pPr>
+        <w:rPr>
+          <w:rFonts w:ascii="Times New Roman" w:eastAsia="標楷體" w:hAnsi="Times New Roman" w:cs="Times New Roman"/>
+        </w:rPr>
+      </w:pPr>
+    </w:p>
+    <w:p>
+      <w:pPr>
+        <w:rPr>
+          <w:rFonts w:ascii="Times New Roman" w:eastAsia="標楷體" w:hAnsi="Times New Roman" w:cs="Times New Roman"/>
+        </w:rPr>
+      </w:pPr>
+    </w:p>
+    <w:p>
+      <w:pPr>
+        <w:rPr>
+          <w:rFonts w:ascii="Times New Roman" w:eastAsia="標楷體" w:hAnsi="Times New Roman" w:cs="Times New Roman"/>
+        </w:rPr>
+      </w:pPr>
+    </w:p>
+    <w:p>
+      <w:pPr>
+        <w:rPr>
+          <w:rFonts w:ascii="Times New Roman" w:eastAsia="標楷體" w:hAnsi="Times New Roman" w:cs="Times New Roman"/>
+        </w:rPr>
+      </w:pPr>
+    </w:p>
+    <w:p>
+      <w:pPr>
+        <w:rPr>
+          <w:rFonts w:ascii="Times New Roman" w:eastAsia="標楷體" w:hAnsi="Times New Roman" w:cs="Times New Roman"/>
+        </w:rPr>
+      </w:pPr>
+    </w:p>
+    <w:p>
+      <w:pPr>
+        <w:rPr>
+          <w:rFonts w:ascii="Times New Roman" w:eastAsia="標楷體" w:hAnsi="Times New Roman" w:cs="Times New Roman"/>
+        </w:rPr>
+      </w:pPr>
+    </w:p>
+    <w:p>
+      <w:pPr>
+        <w:rPr>
+          <w:rFonts w:ascii="Times New Roman" w:eastAsia="標楷體" w:hAnsi="Times New Roman" w:cs="Times New Roman"/>
+        </w:rPr>
+      </w:pPr>
+    </w:p>
+    <w:p>
+      <w:pPr>
+        <w:rPr>
+          <w:rFonts w:ascii="Times New Roman" w:eastAsia="標楷體" w:hAnsi="Times New Roman" w:cs="Times New Roman"/>
+        </w:rPr>
+      </w:pPr>
+    </w:p>
+    <w:p>
+      <w:pPr>
+        <w:rPr>
+          <w:rFonts w:ascii="Times New Roman" w:eastAsia="標楷體" w:hAnsi="Times New Roman" w:cs="Times New Roman" w:hint="eastAsia"/>
+        </w:rPr>
+      </w:pPr>
+    </w:p>
+    <w:p>
+      <w:pPr>
         <w:pStyle w:val="2"/>
       </w:pPr>
       <w:r>
@@ -10019,10 +10550,10 @@
           <w:noProof/>
         </w:rPr>
         <w:drawing>
-          <wp:inline distT="0" distB="0" distL="0" distR="0" wp14:anchorId="5BE1C169" wp14:editId="6F9F7EFC">
-            <wp:extent cx="5274310" cy="5931535"/>
+          <wp:inline distT="0" distB="0" distL="0" distR="0" wp14:anchorId="79AFE469" wp14:editId="2B7571F4">
+            <wp:extent cx="5274310" cy="4521200"/>
             <wp:effectExtent l="0" t="0" r="2540" b="0"/>
-            <wp:docPr id="1" name="圖片 1"/>
+            <wp:docPr id="6" name="圖片 6"/>
             <wp:cNvGraphicFramePr>
               <a:graphicFrameLocks xmlns:a="http://schemas.openxmlformats.org/drawingml/2006/main" noChangeAspect="1"/>
             </wp:cNvGraphicFramePr>
@@ -10030,7 +10561,7 @@
               <a:graphicData uri="http://schemas.openxmlformats.org/drawingml/2006/picture">
                 <pic:pic xmlns:pic="http://schemas.openxmlformats.org/drawingml/2006/picture">
                   <pic:nvPicPr>
-                    <pic:cNvPr id="0" name="Picture 1"/>
+                    <pic:cNvPr id="0" name="Picture 7"/>
                     <pic:cNvPicPr>
                       <a:picLocks noChangeAspect="1" noChangeArrowheads="1"/>
                     </pic:cNvPicPr>
@@ -10051,7 +10582,7 @@
                   <pic:spPr bwMode="auto">
                     <a:xfrm>
                       <a:off x="0" y="0"/>
-                      <a:ext cx="5274310" cy="5931535"/>
+                      <a:ext cx="5274310" cy="4521200"/>
                     </a:xfrm>
                     <a:prstGeom prst="rect">
                       <a:avLst/>
@@ -10127,10 +10658,10 @@
           <w:noProof/>
         </w:rPr>
         <w:drawing>
-          <wp:inline distT="0" distB="0" distL="0" distR="0" wp14:anchorId="4813A929" wp14:editId="0E7BFC74">
-            <wp:extent cx="5274310" cy="6175375"/>
-            <wp:effectExtent l="0" t="0" r="2540" b="0"/>
-            <wp:docPr id="3" name="圖片 3"/>
+          <wp:inline distT="0" distB="0" distL="0" distR="0" wp14:anchorId="46F31A97" wp14:editId="6A2401E7">
+            <wp:extent cx="5274310" cy="5198110"/>
+            <wp:effectExtent l="0" t="0" r="2540" b="2540"/>
+            <wp:docPr id="5" name="圖片 5"/>
             <wp:cNvGraphicFramePr>
               <a:graphicFrameLocks xmlns:a="http://schemas.openxmlformats.org/drawingml/2006/main" noChangeAspect="1"/>
             </wp:cNvGraphicFramePr>
@@ -10138,7 +10669,7 @@
               <a:graphicData uri="http://schemas.openxmlformats.org/drawingml/2006/picture">
                 <pic:pic xmlns:pic="http://schemas.openxmlformats.org/drawingml/2006/picture">
                   <pic:nvPicPr>
-                    <pic:cNvPr id="0" name="Picture 3"/>
+                    <pic:cNvPr id="0" name="Picture 5"/>
                     <pic:cNvPicPr>
                       <a:picLocks noChangeAspect="1" noChangeArrowheads="1"/>
                     </pic:cNvPicPr>
@@ -10159,7 +10690,7 @@
                   <pic:spPr bwMode="auto">
                     <a:xfrm>
                       <a:off x="0" y="0"/>
-                      <a:ext cx="5274310" cy="6175375"/>
+                      <a:ext cx="5274310" cy="5198110"/>
                     </a:xfrm>
                     <a:prstGeom prst="rect">
                       <a:avLst/>
@@ -10280,6 +10811,15 @@
     <w:p>
       <w:pPr>
         <w:rPr>
+          <w:rFonts w:ascii="Times New Roman" w:eastAsia="標楷體" w:hAnsi="Times New Roman" w:cs="Times New Roman"/>
+          <w:sz w:val="22"/>
+          <w:szCs w:val="22"/>
+        </w:rPr>
+      </w:pPr>
+    </w:p>
+    <w:p>
+      <w:pPr>
+        <w:rPr>
           <w:rFonts w:ascii="Times New Roman" w:eastAsia="標楷體" w:hAnsi="Times New Roman" w:cs="Times New Roman" w:hint="eastAsia"/>
           <w:sz w:val="22"/>
           <w:szCs w:val="22"/>
@@ -10295,7 +10835,7 @@
           <w:rFonts w:hint="eastAsia"/>
         </w:rPr>
         <w:lastRenderedPageBreak/>
-        <w:t>7</w:t>
+        <w:t>3</w:t>
       </w:r>
       <w:r>
         <w:rPr>
@@ -10460,7 +11000,7 @@
               <w:rPr>
                 <w:rFonts w:ascii="Times New Roman" w:eastAsia="標楷體" w:hAnsi="Times New Roman" w:cs="Times New Roman" w:hint="eastAsia"/>
               </w:rPr>
-              <w:t>27.44h</w:t>
+              <w:t>48.44h</w:t>
             </w:r>
           </w:p>
         </w:tc>
@@ -11245,20 +11785,14 @@
         <w:tc>
           <w:tcPr>
             <w:tcW w:w="1189" w:type="dxa"/>
-            <w:vMerge w:val="restart"/>
-          </w:tcPr>
-          <w:p>
-            <w:pPr>
-              <w:rPr>
-                <w:rFonts w:ascii="Times New Roman" w:eastAsia="標楷體" w:hAnsi="Times New Roman" w:cs="Times New Roman"/>
-              </w:rPr>
-            </w:pPr>
-            <w:r>
-              <w:rPr>
-                <w:rFonts w:ascii="Times New Roman" w:eastAsia="標楷體" w:hAnsi="Times New Roman" w:cs="Times New Roman" w:hint="eastAsia"/>
-              </w:rPr>
-              <w:t>17.5h</w:t>
-            </w:r>
+            <w:vMerge/>
+          </w:tcPr>
+          <w:p>
+            <w:pPr>
+              <w:rPr>
+                <w:rFonts w:ascii="Times New Roman" w:eastAsia="標楷體" w:hAnsi="Times New Roman" w:cs="Times New Roman"/>
+              </w:rPr>
+            </w:pPr>
           </w:p>
         </w:tc>
       </w:tr>
@@ -11537,11 +12071,12 @@
         <w:tc>
           <w:tcPr>
             <w:tcW w:w="1877" w:type="dxa"/>
-          </w:tcPr>
-          <w:p>
-            <w:pPr>
-              <w:rPr>
-                <w:rFonts w:ascii="Times New Roman" w:eastAsia="標楷體" w:hAnsi="Times New Roman" w:cs="Times New Roman" w:hint="eastAsia"/>
+            <w:vMerge w:val="restart"/>
+          </w:tcPr>
+          <w:p>
+            <w:pPr>
+              <w:rPr>
+                <w:rFonts w:ascii="Times New Roman" w:eastAsia="標楷體" w:hAnsi="Times New Roman" w:cs="Times New Roman"/>
               </w:rPr>
             </w:pPr>
             <w:r>
@@ -11559,20 +12094,14 @@
           <w:p>
             <w:pPr>
               <w:rPr>
-                <w:rFonts w:ascii="Times New Roman" w:eastAsia="標楷體" w:hAnsi="Times New Roman" w:cs="Times New Roman" w:hint="eastAsia"/>
-              </w:rPr>
-            </w:pPr>
-            <w:r>
-              <w:rPr>
-                <w:rFonts w:ascii="Times New Roman" w:eastAsia="標楷體" w:hAnsi="Times New Roman" w:cs="Times New Roman" w:hint="eastAsia"/>
-              </w:rPr>
-              <w:t>26/05/25 09:30~</w:t>
-            </w:r>
-            <w:r>
-              <w:rPr>
-                <w:rFonts w:ascii="Times New Roman" w:eastAsia="標楷體" w:hAnsi="Times New Roman" w:cs="Times New Roman" w:hint="eastAsia"/>
-              </w:rPr>
-              <w:t>10:30</w:t>
+                <w:rFonts w:ascii="Times New Roman" w:eastAsia="標楷體" w:hAnsi="Times New Roman" w:cs="Times New Roman"/>
+              </w:rPr>
+            </w:pPr>
+            <w:r>
+              <w:rPr>
+                <w:rFonts w:ascii="Times New Roman" w:eastAsia="標楷體" w:hAnsi="Times New Roman" w:cs="Times New Roman" w:hint="eastAsia"/>
+              </w:rPr>
+              <w:t>26/05/25 09:30~10:30</w:t>
             </w:r>
           </w:p>
         </w:tc>
@@ -11597,6 +12126,74 @@
         <w:tc>
           <w:tcPr>
             <w:tcW w:w="1189" w:type="dxa"/>
+            <w:vMerge/>
+          </w:tcPr>
+          <w:p>
+            <w:pPr>
+              <w:rPr>
+                <w:rFonts w:ascii="Times New Roman" w:eastAsia="標楷體" w:hAnsi="Times New Roman" w:cs="Times New Roman" w:hint="eastAsia"/>
+              </w:rPr>
+            </w:pPr>
+          </w:p>
+        </w:tc>
+      </w:tr>
+      <w:tr>
+        <w:trPr>
+          <w:trHeight w:val="336"/>
+        </w:trPr>
+        <w:tc>
+          <w:tcPr>
+            <w:tcW w:w="1877" w:type="dxa"/>
+            <w:vMerge/>
+          </w:tcPr>
+          <w:p>
+            <w:pPr>
+              <w:rPr>
+                <w:rFonts w:ascii="Times New Roman" w:eastAsia="標楷體" w:hAnsi="Times New Roman" w:cs="Times New Roman" w:hint="eastAsia"/>
+              </w:rPr>
+            </w:pPr>
+          </w:p>
+        </w:tc>
+        <w:tc>
+          <w:tcPr>
+            <w:tcW w:w="3829" w:type="dxa"/>
+          </w:tcPr>
+          <w:p>
+            <w:pPr>
+              <w:rPr>
+                <w:rFonts w:ascii="Times New Roman" w:eastAsia="標楷體" w:hAnsi="Times New Roman" w:cs="Times New Roman" w:hint="eastAsia"/>
+              </w:rPr>
+            </w:pPr>
+            <w:r>
+              <w:rPr>
+                <w:rFonts w:ascii="Times New Roman" w:eastAsia="標楷體" w:hAnsi="Times New Roman" w:cs="Times New Roman" w:hint="eastAsia"/>
+              </w:rPr>
+              <w:t>26/05/27 15:30~18:00</w:t>
+            </w:r>
+          </w:p>
+        </w:tc>
+        <w:tc>
+          <w:tcPr>
+            <w:tcW w:w="1350" w:type="dxa"/>
+          </w:tcPr>
+          <w:p>
+            <w:pPr>
+              <w:rPr>
+                <w:rFonts w:ascii="Times New Roman" w:eastAsia="標楷體" w:hAnsi="Times New Roman" w:cs="Times New Roman" w:hint="eastAsia"/>
+              </w:rPr>
+            </w:pPr>
+            <w:r>
+              <w:rPr>
+                <w:rFonts w:ascii="Times New Roman" w:eastAsia="標楷體" w:hAnsi="Times New Roman" w:cs="Times New Roman" w:hint="eastAsia"/>
+              </w:rPr>
+              <w:t>2.5h</w:t>
+            </w:r>
+          </w:p>
+        </w:tc>
+        <w:tc>
+          <w:tcPr>
+            <w:tcW w:w="1189" w:type="dxa"/>
+            <w:vMerge/>
           </w:tcPr>
           <w:p>
             <w:pPr>

</xml_diff>